<commit_message>
appendices and source listings
</commit_message>
<xml_diff>
--- a/results/dissertation.docx
+++ b/results/dissertation.docx
@@ -5194,6 +5194,3254 @@
         <w:t>Wilson, G, Aruliah, D A, Brown, C T, Chue Hong, N P, Davis, M, Guy, R T, Haddock, S H D, Huff, K D, Mitchell, I M, Plumbley, M D, Waugh, B, White, E P and Wilson, P 2014. Best practices for scientific computing. PLoS Biology, 12(1), e1001745.</w:t>
       </w:r>
     </w:p>
+    <w:p>
+      <w:pPr>
+        <w:pStyle w:val="Heading1"/>
+        <w:pageBreakBefore/>
+      </w:pPr>
+      <w:r>
+        <w:t>Appendix A: Code and Reproducibility</w:t>
+      </w:r>
+    </w:p>
+    <w:p>
+      <w:pPr>
+        <w:jc w:val="both"/>
+      </w:pPr>
+      <w:r>
+        <w:rPr>
+          <w:b w:val="0"/>
+          <w:sz w:val="24"/>
+        </w:rPr>
+        <w:t>The complete simulation framework, the scripts that produced every figure and table, and the raw output of each experiment are in the accompanying repository. The src directory holds the model and the dynamics: contest.py defines the contest success function and payoffs, best_response.py implements the scan-and-refine solver of Section 3.2, dynamics.py implements the three update rules of Section 3.3, analysis.py provides the convergence statistics and eigenvalue analysis of Section 3.6, and plots.py holds the shared plotting routines. The experiments directory holds one script per experiment, named to match the numbering used in Chapter 4. The results directory holds the sixteen figures and the saved numerical output of every run.</w:t>
+      </w:r>
+    </w:p>
+    <w:p>
+      <w:pPr>
+        <w:jc w:val="both"/>
+      </w:pPr>
+      <w:r>
+        <w:rPr>
+          <w:b w:val="0"/>
+          <w:sz w:val="24"/>
+        </w:rPr>
+        <w:t>Each experiment is independent and reproduces its own portion of Chapter 4 when run from the repository root, for example 'python experiments/exp6_grid.py' for the parameter sweep of Section 4.6. Random seeds are fixed within each script, so repeated runs on the same platform reproduce the reported figures. The analysis report of Section 3.6 is produced by 'python experiments/analysis_report.py', and the individual configurations quoted in Chapter 4 that do not belong to a sweep by 'python experiments/extra_checks.py'. Each script writes its results to results/data as JSON, alongside the figures it produces in results/figures. The longer sweeps checkpoint each cell to results/data/cache so an interrupted run resumes rather than restarting; deleting that directory forces a clean recomputation.</w:t>
+      </w:r>
+    </w:p>
+    <w:p>
+      <w:pPr>
+        <w:jc w:val="both"/>
+      </w:pPr>
+      <w:r>
+        <w:rPr>
+          <w:b w:val="0"/>
+          <w:sz w:val="24"/>
+        </w:rPr>
+        <w:t>Correctness is enforced by an automated suite of eighty-nine tests, run with 'pytest' from the repository root, covering the contest model, the best response solver, the three update rules, the statistical analysis and the plotting helpers. The suite is described in Section 3.5. Its most important members validate the simulation against the closed form equilibrium of Tullock (1980) and pin the best response solver against a brute force global maximum across the full range of decisiveness values used in the experiments. Dependencies are recorded in requirements.txt.</w:t>
+      </w:r>
+    </w:p>
+    <w:p>
+      <w:pPr>
+        <w:pStyle w:val="Heading1"/>
+        <w:pageBreakBefore/>
+      </w:pPr>
+      <w:r>
+        <w:t>Appendix B: Source Code</w:t>
+      </w:r>
+    </w:p>
+    <w:p>
+      <w:pPr>
+        <w:jc w:val="both"/>
+      </w:pPr>
+      <w:r>
+        <w:rPr>
+          <w:b w:val="0"/>
+          <w:sz w:val="24"/>
+        </w:rPr>
+        <w:t>The three modules reproduced here are the core of the framework: the contest model, the best response solver, and the three update rules. Together they are the part of the codebase on which every result in Chapter 4 depends, and the part where the design decisions discussed in Sections 3.2 and 3.4 are made. The experiment scripts, the analysis and plotting modules and the test suite are omitted here for length and are in the submitted repository.</w:t>
+      </w:r>
+    </w:p>
+    <w:p>
+      <w:pPr>
+        <w:jc w:val="both"/>
+      </w:pPr>
+      <w:r>
+        <w:rPr>
+          <w:b w:val="0"/>
+          <w:sz w:val="24"/>
+        </w:rPr>
+        <w:t>Read them in the order given. contest.py defines the contest success function and payoffs and is the only place the model itself is written down; own_payoff_curve exists so the solver can evaluate hundreds of candidate efforts in one array operation, and is pinned against the scalar payoff by test. best_response.py contains the scan-and-refine solver. dynamics.py implements the three update rules and the fixed point convergence test they share.</w:t>
+      </w:r>
+    </w:p>
+    <w:p>
+      <w:r>
+        <w:rPr>
+          <w:rFonts w:ascii="Consolas" w:hAnsi="Consolas"/>
+          <w:b/>
+          <w:sz w:val="22"/>
+        </w:rPr>
+        <w:t>src/contest.py</w:t>
+      </w:r>
+    </w:p>
+    <w:p>
+      <w:pPr>
+        <w:spacing w:before="0" w:after="0" w:line="240" w:lineRule="auto"/>
+      </w:pPr>
+      <w:r>
+        <w:rPr>
+          <w:rFonts w:ascii="Consolas" w:hAnsi="Consolas"/>
+          <w:sz w:val="16"/>
+        </w:rPr>
+        <w:t>"""Tullock contest model.</w:t>
+      </w:r>
+    </w:p>
+    <w:p>
+      <w:pPr>
+        <w:spacing w:before="0" w:after="0" w:line="240" w:lineRule="auto"/>
+      </w:pPr>
+      <w:r>
+        <w:rPr>
+          <w:rFonts w:ascii="Consolas" w:hAnsi="Consolas"/>
+          <w:sz w:val="16"/>
+        </w:rPr>
+      </w:r>
+    </w:p>
+    <w:p>
+      <w:pPr>
+        <w:spacing w:before="0" w:after="0" w:line="240" w:lineRule="auto"/>
+      </w:pPr>
+      <w:r>
+        <w:rPr>
+          <w:rFonts w:ascii="Consolas" w:hAnsi="Consolas"/>
+          <w:sz w:val="16"/>
+        </w:rPr>
+        <w:t>n players choose efforts x_i &gt;= 0. Player i wins with probability</w:t>
+      </w:r>
+    </w:p>
+    <w:p>
+      <w:pPr>
+        <w:spacing w:before="0" w:after="0" w:line="240" w:lineRule="auto"/>
+      </w:pPr>
+      <w:r>
+        <w:rPr>
+          <w:rFonts w:ascii="Consolas" w:hAnsi="Consolas"/>
+          <w:sz w:val="16"/>
+        </w:rPr>
+        <w:t>x_i^r / sum_j x_j^r and pays a cost x_i^alpha.</w:t>
+      </w:r>
+    </w:p>
+    <w:p>
+      <w:pPr>
+        <w:spacing w:before="0" w:after="0" w:line="240" w:lineRule="auto"/>
+      </w:pPr>
+      <w:r>
+        <w:rPr>
+          <w:rFonts w:ascii="Consolas" w:hAnsi="Consolas"/>
+          <w:sz w:val="16"/>
+        </w:rPr>
+        <w:t>"""</w:t>
+      </w:r>
+    </w:p>
+    <w:p>
+      <w:pPr>
+        <w:spacing w:before="0" w:after="0" w:line="240" w:lineRule="auto"/>
+      </w:pPr>
+      <w:r>
+        <w:rPr>
+          <w:rFonts w:ascii="Consolas" w:hAnsi="Consolas"/>
+          <w:sz w:val="16"/>
+        </w:rPr>
+      </w:r>
+    </w:p>
+    <w:p>
+      <w:pPr>
+        <w:spacing w:before="0" w:after="0" w:line="240" w:lineRule="auto"/>
+      </w:pPr>
+      <w:r>
+        <w:rPr>
+          <w:rFonts w:ascii="Consolas" w:hAnsi="Consolas"/>
+          <w:sz w:val="16"/>
+        </w:rPr>
+        <w:t>import numpy as np</w:t>
+      </w:r>
+    </w:p>
+    <w:p>
+      <w:pPr>
+        <w:spacing w:before="0" w:after="0" w:line="240" w:lineRule="auto"/>
+      </w:pPr>
+      <w:r>
+        <w:rPr>
+          <w:rFonts w:ascii="Consolas" w:hAnsi="Consolas"/>
+          <w:sz w:val="16"/>
+        </w:rPr>
+      </w:r>
+    </w:p>
+    <w:p>
+      <w:pPr>
+        <w:spacing w:before="0" w:after="0" w:line="240" w:lineRule="auto"/>
+      </w:pPr>
+      <w:r>
+        <w:rPr>
+          <w:rFonts w:ascii="Consolas" w:hAnsi="Consolas"/>
+          <w:sz w:val="16"/>
+        </w:rPr>
+      </w:r>
+    </w:p>
+    <w:p>
+      <w:pPr>
+        <w:spacing w:before="0" w:after="0" w:line="240" w:lineRule="auto"/>
+      </w:pPr>
+      <w:r>
+        <w:rPr>
+          <w:rFonts w:ascii="Consolas" w:hAnsi="Consolas"/>
+          <w:sz w:val="16"/>
+        </w:rPr>
+        <w:t>class TullockContest:</w:t>
+      </w:r>
+    </w:p>
+    <w:p>
+      <w:pPr>
+        <w:spacing w:before="0" w:after="0" w:line="240" w:lineRule="auto"/>
+      </w:pPr>
+      <w:r>
+        <w:rPr>
+          <w:rFonts w:ascii="Consolas" w:hAnsi="Consolas"/>
+          <w:sz w:val="16"/>
+        </w:rPr>
+        <w:t xml:space="preserve">    """A Tullock contest between n players.</w:t>
+      </w:r>
+    </w:p>
+    <w:p>
+      <w:pPr>
+        <w:spacing w:before="0" w:after="0" w:line="240" w:lineRule="auto"/>
+      </w:pPr>
+      <w:r>
+        <w:rPr>
+          <w:rFonts w:ascii="Consolas" w:hAnsi="Consolas"/>
+          <w:sz w:val="16"/>
+        </w:rPr>
+      </w:r>
+    </w:p>
+    <w:p>
+      <w:pPr>
+        <w:spacing w:before="0" w:after="0" w:line="240" w:lineRule="auto"/>
+      </w:pPr>
+      <w:r>
+        <w:rPr>
+          <w:rFonts w:ascii="Consolas" w:hAnsi="Consolas"/>
+          <w:sz w:val="16"/>
+        </w:rPr>
+        <w:t xml:space="preserve">    n           number of players (&gt;= 2)</w:t>
+      </w:r>
+    </w:p>
+    <w:p>
+      <w:pPr>
+        <w:spacing w:before="0" w:after="0" w:line="240" w:lineRule="auto"/>
+      </w:pPr>
+      <w:r>
+        <w:rPr>
+          <w:rFonts w:ascii="Consolas" w:hAnsi="Consolas"/>
+          <w:sz w:val="16"/>
+        </w:rPr>
+        <w:t xml:space="preserve">    r           decisiveness. Low r is lottery-like, high r winner-take-all.</w:t>
+      </w:r>
+    </w:p>
+    <w:p>
+      <w:pPr>
+        <w:spacing w:before="0" w:after="0" w:line="240" w:lineRule="auto"/>
+      </w:pPr>
+      <w:r>
+        <w:rPr>
+          <w:rFonts w:ascii="Consolas" w:hAnsi="Consolas"/>
+          <w:sz w:val="16"/>
+        </w:rPr>
+        <w:t xml:space="preserve">    valuations  prize value V_i for each player</w:t>
+      </w:r>
+    </w:p>
+    <w:p>
+      <w:pPr>
+        <w:spacing w:before="0" w:after="0" w:line="240" w:lineRule="auto"/>
+      </w:pPr>
+      <w:r>
+        <w:rPr>
+          <w:rFonts w:ascii="Consolas" w:hAnsi="Consolas"/>
+          <w:sz w:val="16"/>
+        </w:rPr>
+        <w:t xml:space="preserve">    alpha       cost exponent (1 = linear, 2 = quadratic)</w:t>
+      </w:r>
+    </w:p>
+    <w:p>
+      <w:pPr>
+        <w:spacing w:before="0" w:after="0" w:line="240" w:lineRule="auto"/>
+      </w:pPr>
+      <w:r>
+        <w:rPr>
+          <w:rFonts w:ascii="Consolas" w:hAnsi="Consolas"/>
+          <w:sz w:val="16"/>
+        </w:rPr>
+        <w:t xml:space="preserve">    """</w:t>
+      </w:r>
+    </w:p>
+    <w:p>
+      <w:pPr>
+        <w:spacing w:before="0" w:after="0" w:line="240" w:lineRule="auto"/>
+      </w:pPr>
+      <w:r>
+        <w:rPr>
+          <w:rFonts w:ascii="Consolas" w:hAnsi="Consolas"/>
+          <w:sz w:val="16"/>
+        </w:rPr>
+      </w:r>
+    </w:p>
+    <w:p>
+      <w:pPr>
+        <w:spacing w:before="0" w:after="0" w:line="240" w:lineRule="auto"/>
+      </w:pPr>
+      <w:r>
+        <w:rPr>
+          <w:rFonts w:ascii="Consolas" w:hAnsi="Consolas"/>
+          <w:sz w:val="16"/>
+        </w:rPr>
+        <w:t xml:space="preserve">    def __init__(self, n, r, valuations, alpha=1.0):</w:t>
+      </w:r>
+    </w:p>
+    <w:p>
+      <w:pPr>
+        <w:spacing w:before="0" w:after="0" w:line="240" w:lineRule="auto"/>
+      </w:pPr>
+      <w:r>
+        <w:rPr>
+          <w:rFonts w:ascii="Consolas" w:hAnsi="Consolas"/>
+          <w:sz w:val="16"/>
+        </w:rPr>
+        <w:t xml:space="preserve">        valuations = np.asarray(valuations, dtype=float)</w:t>
+      </w:r>
+    </w:p>
+    <w:p>
+      <w:pPr>
+        <w:spacing w:before="0" w:after="0" w:line="240" w:lineRule="auto"/>
+      </w:pPr>
+      <w:r>
+        <w:rPr>
+          <w:rFonts w:ascii="Consolas" w:hAnsi="Consolas"/>
+          <w:sz w:val="16"/>
+        </w:rPr>
+      </w:r>
+    </w:p>
+    <w:p>
+      <w:pPr>
+        <w:spacing w:before="0" w:after="0" w:line="240" w:lineRule="auto"/>
+      </w:pPr>
+      <w:r>
+        <w:rPr>
+          <w:rFonts w:ascii="Consolas" w:hAnsi="Consolas"/>
+          <w:sz w:val="16"/>
+        </w:rPr>
+        <w:t xml:space="preserve">        if n &lt; 2:</w:t>
+      </w:r>
+    </w:p>
+    <w:p>
+      <w:pPr>
+        <w:spacing w:before="0" w:after="0" w:line="240" w:lineRule="auto"/>
+      </w:pPr>
+      <w:r>
+        <w:rPr>
+          <w:rFonts w:ascii="Consolas" w:hAnsi="Consolas"/>
+          <w:sz w:val="16"/>
+        </w:rPr>
+        <w:t xml:space="preserve">            raise ValueError(f"need at least 2 players, got n={n}")</w:t>
+      </w:r>
+    </w:p>
+    <w:p>
+      <w:pPr>
+        <w:spacing w:before="0" w:after="0" w:line="240" w:lineRule="auto"/>
+      </w:pPr>
+      <w:r>
+        <w:rPr>
+          <w:rFonts w:ascii="Consolas" w:hAnsi="Consolas"/>
+          <w:sz w:val="16"/>
+        </w:rPr>
+        <w:t xml:space="preserve">        if r &lt;= 0:</w:t>
+      </w:r>
+    </w:p>
+    <w:p>
+      <w:pPr>
+        <w:spacing w:before="0" w:after="0" w:line="240" w:lineRule="auto"/>
+      </w:pPr>
+      <w:r>
+        <w:rPr>
+          <w:rFonts w:ascii="Consolas" w:hAnsi="Consolas"/>
+          <w:sz w:val="16"/>
+        </w:rPr>
+        <w:t xml:space="preserve">            raise ValueError(f"r must be positive, got {r}")</w:t>
+      </w:r>
+    </w:p>
+    <w:p>
+      <w:pPr>
+        <w:spacing w:before="0" w:after="0" w:line="240" w:lineRule="auto"/>
+      </w:pPr>
+      <w:r>
+        <w:rPr>
+          <w:rFonts w:ascii="Consolas" w:hAnsi="Consolas"/>
+          <w:sz w:val="16"/>
+        </w:rPr>
+        <w:t xml:space="preserve">        if valuations.shape != (n,):</w:t>
+      </w:r>
+    </w:p>
+    <w:p>
+      <w:pPr>
+        <w:spacing w:before="0" w:after="0" w:line="240" w:lineRule="auto"/>
+      </w:pPr>
+      <w:r>
+        <w:rPr>
+          <w:rFonts w:ascii="Consolas" w:hAnsi="Consolas"/>
+          <w:sz w:val="16"/>
+        </w:rPr>
+        <w:t xml:space="preserve">            raise ValueError(f"expected {n} valuations, got {valuations.shape[0]}")</w:t>
+      </w:r>
+    </w:p>
+    <w:p>
+      <w:pPr>
+        <w:spacing w:before="0" w:after="0" w:line="240" w:lineRule="auto"/>
+      </w:pPr>
+      <w:r>
+        <w:rPr>
+          <w:rFonts w:ascii="Consolas" w:hAnsi="Consolas"/>
+          <w:sz w:val="16"/>
+        </w:rPr>
+        <w:t xml:space="preserve">        if np.any(valuations &lt;= 0):</w:t>
+      </w:r>
+    </w:p>
+    <w:p>
+      <w:pPr>
+        <w:spacing w:before="0" w:after="0" w:line="240" w:lineRule="auto"/>
+      </w:pPr>
+      <w:r>
+        <w:rPr>
+          <w:rFonts w:ascii="Consolas" w:hAnsi="Consolas"/>
+          <w:sz w:val="16"/>
+        </w:rPr>
+        <w:t xml:space="preserve">            raise ValueError("valuations must be positive")</w:t>
+      </w:r>
+    </w:p>
+    <w:p>
+      <w:pPr>
+        <w:spacing w:before="0" w:after="0" w:line="240" w:lineRule="auto"/>
+      </w:pPr>
+      <w:r>
+        <w:rPr>
+          <w:rFonts w:ascii="Consolas" w:hAnsi="Consolas"/>
+          <w:sz w:val="16"/>
+        </w:rPr>
+        <w:t xml:space="preserve">        if alpha &lt; 1:</w:t>
+      </w:r>
+    </w:p>
+    <w:p>
+      <w:pPr>
+        <w:spacing w:before="0" w:after="0" w:line="240" w:lineRule="auto"/>
+      </w:pPr>
+      <w:r>
+        <w:rPr>
+          <w:rFonts w:ascii="Consolas" w:hAnsi="Consolas"/>
+          <w:sz w:val="16"/>
+        </w:rPr>
+        <w:t xml:space="preserve">            raise ValueError(f"alpha must be &gt;= 1, got {alpha}")</w:t>
+      </w:r>
+    </w:p>
+    <w:p>
+      <w:pPr>
+        <w:spacing w:before="0" w:after="0" w:line="240" w:lineRule="auto"/>
+      </w:pPr>
+      <w:r>
+        <w:rPr>
+          <w:rFonts w:ascii="Consolas" w:hAnsi="Consolas"/>
+          <w:sz w:val="16"/>
+        </w:rPr>
+      </w:r>
+    </w:p>
+    <w:p>
+      <w:pPr>
+        <w:spacing w:before="0" w:after="0" w:line="240" w:lineRule="auto"/>
+      </w:pPr>
+      <w:r>
+        <w:rPr>
+          <w:rFonts w:ascii="Consolas" w:hAnsi="Consolas"/>
+          <w:sz w:val="16"/>
+        </w:rPr>
+        <w:t xml:space="preserve">        self.n = n</w:t>
+      </w:r>
+    </w:p>
+    <w:p>
+      <w:pPr>
+        <w:spacing w:before="0" w:after="0" w:line="240" w:lineRule="auto"/>
+      </w:pPr>
+      <w:r>
+        <w:rPr>
+          <w:rFonts w:ascii="Consolas" w:hAnsi="Consolas"/>
+          <w:sz w:val="16"/>
+        </w:rPr>
+        <w:t xml:space="preserve">        self.r = r</w:t>
+      </w:r>
+    </w:p>
+    <w:p>
+      <w:pPr>
+        <w:spacing w:before="0" w:after="0" w:line="240" w:lineRule="auto"/>
+      </w:pPr>
+      <w:r>
+        <w:rPr>
+          <w:rFonts w:ascii="Consolas" w:hAnsi="Consolas"/>
+          <w:sz w:val="16"/>
+        </w:rPr>
+        <w:t xml:space="preserve">        self.valuations = valuations</w:t>
+      </w:r>
+    </w:p>
+    <w:p>
+      <w:pPr>
+        <w:spacing w:before="0" w:after="0" w:line="240" w:lineRule="auto"/>
+      </w:pPr>
+      <w:r>
+        <w:rPr>
+          <w:rFonts w:ascii="Consolas" w:hAnsi="Consolas"/>
+          <w:sz w:val="16"/>
+        </w:rPr>
+        <w:t xml:space="preserve">        self.alpha = alpha</w:t>
+      </w:r>
+    </w:p>
+    <w:p>
+      <w:pPr>
+        <w:spacing w:before="0" w:after="0" w:line="240" w:lineRule="auto"/>
+      </w:pPr>
+      <w:r>
+        <w:rPr>
+          <w:rFonts w:ascii="Consolas" w:hAnsi="Consolas"/>
+          <w:sz w:val="16"/>
+        </w:rPr>
+      </w:r>
+    </w:p>
+    <w:p>
+      <w:pPr>
+        <w:spacing w:before="0" w:after="0" w:line="240" w:lineRule="auto"/>
+      </w:pPr>
+      <w:r>
+        <w:rPr>
+          <w:rFonts w:ascii="Consolas" w:hAnsi="Consolas"/>
+          <w:sz w:val="16"/>
+        </w:rPr>
+        <w:t xml:space="preserve">    def winning_probability(self, efforts):</w:t>
+      </w:r>
+    </w:p>
+    <w:p>
+      <w:pPr>
+        <w:spacing w:before="0" w:after="0" w:line="240" w:lineRule="auto"/>
+      </w:pPr>
+      <w:r>
+        <w:rPr>
+          <w:rFonts w:ascii="Consolas" w:hAnsi="Consolas"/>
+          <w:sz w:val="16"/>
+        </w:rPr>
+        <w:t xml:space="preserve">        """Winning probability for each player."""</w:t>
+      </w:r>
+    </w:p>
+    <w:p>
+      <w:pPr>
+        <w:spacing w:before="0" w:after="0" w:line="240" w:lineRule="auto"/>
+      </w:pPr>
+      <w:r>
+        <w:rPr>
+          <w:rFonts w:ascii="Consolas" w:hAnsi="Consolas"/>
+          <w:sz w:val="16"/>
+        </w:rPr>
+        <w:t xml:space="preserve">        efforts = np.asarray(efforts, dtype=float)</w:t>
+      </w:r>
+    </w:p>
+    <w:p>
+      <w:pPr>
+        <w:spacing w:before="0" w:after="0" w:line="240" w:lineRule="auto"/>
+      </w:pPr>
+      <w:r>
+        <w:rPr>
+          <w:rFonts w:ascii="Consolas" w:hAnsi="Consolas"/>
+          <w:sz w:val="16"/>
+        </w:rPr>
+      </w:r>
+    </w:p>
+    <w:p>
+      <w:pPr>
+        <w:spacing w:before="0" w:after="0" w:line="240" w:lineRule="auto"/>
+      </w:pPr>
+      <w:r>
+        <w:rPr>
+          <w:rFonts w:ascii="Consolas" w:hAnsi="Consolas"/>
+          <w:sz w:val="16"/>
+        </w:rPr>
+        <w:t xml:space="preserve">        # The success function is 0/0 if nobody exerts any effort.</w:t>
+      </w:r>
+    </w:p>
+    <w:p>
+      <w:pPr>
+        <w:spacing w:before="0" w:after="0" w:line="240" w:lineRule="auto"/>
+      </w:pPr>
+      <w:r>
+        <w:rPr>
+          <w:rFonts w:ascii="Consolas" w:hAnsi="Consolas"/>
+          <w:sz w:val="16"/>
+        </w:rPr>
+        <w:t xml:space="preserve">        if np.all(efforts == 0):</w:t>
+      </w:r>
+    </w:p>
+    <w:p>
+      <w:pPr>
+        <w:spacing w:before="0" w:after="0" w:line="240" w:lineRule="auto"/>
+      </w:pPr>
+      <w:r>
+        <w:rPr>
+          <w:rFonts w:ascii="Consolas" w:hAnsi="Consolas"/>
+          <w:sz w:val="16"/>
+        </w:rPr>
+        <w:t xml:space="preserve">            return np.full(self.n, 1.0 / self.n)</w:t>
+      </w:r>
+    </w:p>
+    <w:p>
+      <w:pPr>
+        <w:spacing w:before="0" w:after="0" w:line="240" w:lineRule="auto"/>
+      </w:pPr>
+      <w:r>
+        <w:rPr>
+          <w:rFonts w:ascii="Consolas" w:hAnsi="Consolas"/>
+          <w:sz w:val="16"/>
+        </w:rPr>
+      </w:r>
+    </w:p>
+    <w:p>
+      <w:pPr>
+        <w:spacing w:before="0" w:after="0" w:line="240" w:lineRule="auto"/>
+      </w:pPr>
+      <w:r>
+        <w:rPr>
+          <w:rFonts w:ascii="Consolas" w:hAnsi="Consolas"/>
+          <w:sz w:val="16"/>
+        </w:rPr>
+        <w:t xml:space="preserve">        powered = efforts ** self.r</w:t>
+      </w:r>
+    </w:p>
+    <w:p>
+      <w:pPr>
+        <w:spacing w:before="0" w:after="0" w:line="240" w:lineRule="auto"/>
+      </w:pPr>
+      <w:r>
+        <w:rPr>
+          <w:rFonts w:ascii="Consolas" w:hAnsi="Consolas"/>
+          <w:sz w:val="16"/>
+        </w:rPr>
+        <w:t xml:space="preserve">        return powered / powered.sum()</w:t>
+      </w:r>
+    </w:p>
+    <w:p>
+      <w:pPr>
+        <w:spacing w:before="0" w:after="0" w:line="240" w:lineRule="auto"/>
+      </w:pPr>
+      <w:r>
+        <w:rPr>
+          <w:rFonts w:ascii="Consolas" w:hAnsi="Consolas"/>
+          <w:sz w:val="16"/>
+        </w:rPr>
+      </w:r>
+    </w:p>
+    <w:p>
+      <w:pPr>
+        <w:spacing w:before="0" w:after="0" w:line="240" w:lineRule="auto"/>
+      </w:pPr>
+      <w:r>
+        <w:rPr>
+          <w:rFonts w:ascii="Consolas" w:hAnsi="Consolas"/>
+          <w:sz w:val="16"/>
+        </w:rPr>
+        <w:t xml:space="preserve">    def cost(self, effort):</w:t>
+      </w:r>
+    </w:p>
+    <w:p>
+      <w:pPr>
+        <w:spacing w:before="0" w:after="0" w:line="240" w:lineRule="auto"/>
+      </w:pPr>
+      <w:r>
+        <w:rPr>
+          <w:rFonts w:ascii="Consolas" w:hAnsi="Consolas"/>
+          <w:sz w:val="16"/>
+        </w:rPr>
+        <w:t xml:space="preserve">        return effort ** self.alpha</w:t>
+      </w:r>
+    </w:p>
+    <w:p>
+      <w:pPr>
+        <w:spacing w:before="0" w:after="0" w:line="240" w:lineRule="auto"/>
+      </w:pPr>
+      <w:r>
+        <w:rPr>
+          <w:rFonts w:ascii="Consolas" w:hAnsi="Consolas"/>
+          <w:sz w:val="16"/>
+        </w:rPr>
+      </w:r>
+    </w:p>
+    <w:p>
+      <w:pPr>
+        <w:spacing w:before="0" w:after="0" w:line="240" w:lineRule="auto"/>
+      </w:pPr>
+      <w:r>
+        <w:rPr>
+          <w:rFonts w:ascii="Consolas" w:hAnsi="Consolas"/>
+          <w:sz w:val="16"/>
+        </w:rPr>
+        <w:t xml:space="preserve">    def payoff(self, efforts, player_index):</w:t>
+      </w:r>
+    </w:p>
+    <w:p>
+      <w:pPr>
+        <w:spacing w:before="0" w:after="0" w:line="240" w:lineRule="auto"/>
+      </w:pPr>
+      <w:r>
+        <w:rPr>
+          <w:rFonts w:ascii="Consolas" w:hAnsi="Consolas"/>
+          <w:sz w:val="16"/>
+        </w:rPr>
+        <w:t xml:space="preserve">        """Payoff to one player."""</w:t>
+      </w:r>
+    </w:p>
+    <w:p>
+      <w:pPr>
+        <w:spacing w:before="0" w:after="0" w:line="240" w:lineRule="auto"/>
+      </w:pPr>
+      <w:r>
+        <w:rPr>
+          <w:rFonts w:ascii="Consolas" w:hAnsi="Consolas"/>
+          <w:sz w:val="16"/>
+        </w:rPr>
+        <w:t xml:space="preserve">        probs = self.winning_probability(efforts)</w:t>
+      </w:r>
+    </w:p>
+    <w:p>
+      <w:pPr>
+        <w:spacing w:before="0" w:after="0" w:line="240" w:lineRule="auto"/>
+      </w:pPr>
+      <w:r>
+        <w:rPr>
+          <w:rFonts w:ascii="Consolas" w:hAnsi="Consolas"/>
+          <w:sz w:val="16"/>
+        </w:rPr>
+        <w:t xml:space="preserve">        return (probs[player_index] * self.valuations[player_index]</w:t>
+      </w:r>
+    </w:p>
+    <w:p>
+      <w:pPr>
+        <w:spacing w:before="0" w:after="0" w:line="240" w:lineRule="auto"/>
+      </w:pPr>
+      <w:r>
+        <w:rPr>
+          <w:rFonts w:ascii="Consolas" w:hAnsi="Consolas"/>
+          <w:sz w:val="16"/>
+        </w:rPr>
+        <w:t xml:space="preserve">                - self.cost(efforts[player_index]))</w:t>
+      </w:r>
+    </w:p>
+    <w:p>
+      <w:pPr>
+        <w:spacing w:before="0" w:after="0" w:line="240" w:lineRule="auto"/>
+      </w:pPr>
+      <w:r>
+        <w:rPr>
+          <w:rFonts w:ascii="Consolas" w:hAnsi="Consolas"/>
+          <w:sz w:val="16"/>
+        </w:rPr>
+      </w:r>
+    </w:p>
+    <w:p>
+      <w:pPr>
+        <w:spacing w:before="0" w:after="0" w:line="240" w:lineRule="auto"/>
+      </w:pPr>
+      <w:r>
+        <w:rPr>
+          <w:rFonts w:ascii="Consolas" w:hAnsi="Consolas"/>
+          <w:sz w:val="16"/>
+        </w:rPr>
+        <w:t xml:space="preserve">    def all_payoffs(self, efforts):</w:t>
+      </w:r>
+    </w:p>
+    <w:p>
+      <w:pPr>
+        <w:spacing w:before="0" w:after="0" w:line="240" w:lineRule="auto"/>
+      </w:pPr>
+      <w:r>
+        <w:rPr>
+          <w:rFonts w:ascii="Consolas" w:hAnsi="Consolas"/>
+          <w:sz w:val="16"/>
+        </w:rPr>
+        <w:t xml:space="preserve">        efforts = np.asarray(efforts, dtype=float)</w:t>
+      </w:r>
+    </w:p>
+    <w:p>
+      <w:pPr>
+        <w:spacing w:before="0" w:after="0" w:line="240" w:lineRule="auto"/>
+      </w:pPr>
+      <w:r>
+        <w:rPr>
+          <w:rFonts w:ascii="Consolas" w:hAnsi="Consolas"/>
+          <w:sz w:val="16"/>
+        </w:rPr>
+        <w:t xml:space="preserve">        probs = self.winning_probability(efforts)</w:t>
+      </w:r>
+    </w:p>
+    <w:p>
+      <w:pPr>
+        <w:spacing w:before="0" w:after="0" w:line="240" w:lineRule="auto"/>
+      </w:pPr>
+      <w:r>
+        <w:rPr>
+          <w:rFonts w:ascii="Consolas" w:hAnsi="Consolas"/>
+          <w:sz w:val="16"/>
+        </w:rPr>
+        <w:t xml:space="preserve">        return probs * self.valuations - self.cost(efforts)</w:t>
+      </w:r>
+    </w:p>
+    <w:p>
+      <w:pPr>
+        <w:spacing w:before="0" w:after="0" w:line="240" w:lineRule="auto"/>
+      </w:pPr>
+      <w:r>
+        <w:rPr>
+          <w:rFonts w:ascii="Consolas" w:hAnsi="Consolas"/>
+          <w:sz w:val="16"/>
+        </w:rPr>
+      </w:r>
+    </w:p>
+    <w:p>
+      <w:pPr>
+        <w:spacing w:before="0" w:after="0" w:line="240" w:lineRule="auto"/>
+      </w:pPr>
+      <w:r>
+        <w:rPr>
+          <w:rFonts w:ascii="Consolas" w:hAnsi="Consolas"/>
+          <w:sz w:val="16"/>
+        </w:rPr>
+        <w:t xml:space="preserve">    def own_payoff_curve(self, player_index, others_efforts, own_efforts):</w:t>
+      </w:r>
+    </w:p>
+    <w:p>
+      <w:pPr>
+        <w:spacing w:before="0" w:after="0" w:line="240" w:lineRule="auto"/>
+      </w:pPr>
+      <w:r>
+        <w:rPr>
+          <w:rFonts w:ascii="Consolas" w:hAnsi="Consolas"/>
+          <w:sz w:val="16"/>
+        </w:rPr>
+        <w:t xml:space="preserve">        """Payoff to player i over many candidate own efforts at once.</w:t>
+      </w:r>
+    </w:p>
+    <w:p>
+      <w:pPr>
+        <w:spacing w:before="0" w:after="0" w:line="240" w:lineRule="auto"/>
+      </w:pPr>
+      <w:r>
+        <w:rPr>
+          <w:rFonts w:ascii="Consolas" w:hAnsi="Consolas"/>
+          <w:sz w:val="16"/>
+        </w:rPr>
+      </w:r>
+    </w:p>
+    <w:p>
+      <w:pPr>
+        <w:spacing w:before="0" w:after="0" w:line="240" w:lineRule="auto"/>
+      </w:pPr>
+      <w:r>
+        <w:rPr>
+          <w:rFonts w:ascii="Consolas" w:hAnsi="Consolas"/>
+          <w:sz w:val="16"/>
+        </w:rPr>
+        <w:t xml:space="preserve">        Same result as calling payoff() in a loop, but vectorised. The best</w:t>
+      </w:r>
+    </w:p>
+    <w:p>
+      <w:pPr>
+        <w:spacing w:before="0" w:after="0" w:line="240" w:lineRule="auto"/>
+      </w:pPr>
+      <w:r>
+        <w:rPr>
+          <w:rFonts w:ascii="Consolas" w:hAnsi="Consolas"/>
+          <w:sz w:val="16"/>
+        </w:rPr>
+        <w:t xml:space="preserve">        response solver evaluates a few hundred candidates per call.</w:t>
+      </w:r>
+    </w:p>
+    <w:p>
+      <w:pPr>
+        <w:spacing w:before="0" w:after="0" w:line="240" w:lineRule="auto"/>
+      </w:pPr>
+      <w:r>
+        <w:rPr>
+          <w:rFonts w:ascii="Consolas" w:hAnsi="Consolas"/>
+          <w:sz w:val="16"/>
+        </w:rPr>
+        <w:t xml:space="preserve">        """</w:t>
+      </w:r>
+    </w:p>
+    <w:p>
+      <w:pPr>
+        <w:spacing w:before="0" w:after="0" w:line="240" w:lineRule="auto"/>
+      </w:pPr>
+      <w:r>
+        <w:rPr>
+          <w:rFonts w:ascii="Consolas" w:hAnsi="Consolas"/>
+          <w:sz w:val="16"/>
+        </w:rPr>
+        <w:t xml:space="preserve">        own = np.asarray(own_efforts, dtype=float)</w:t>
+      </w:r>
+    </w:p>
+    <w:p>
+      <w:pPr>
+        <w:spacing w:before="0" w:after="0" w:line="240" w:lineRule="auto"/>
+      </w:pPr>
+      <w:r>
+        <w:rPr>
+          <w:rFonts w:ascii="Consolas" w:hAnsi="Consolas"/>
+          <w:sz w:val="16"/>
+        </w:rPr>
+        <w:t xml:space="preserve">        rivals_powered = np.sum(np.asarray(others_efforts, dtype=float) ** self.r)</w:t>
+      </w:r>
+    </w:p>
+    <w:p>
+      <w:pPr>
+        <w:spacing w:before="0" w:after="0" w:line="240" w:lineRule="auto"/>
+      </w:pPr>
+      <w:r>
+        <w:rPr>
+          <w:rFonts w:ascii="Consolas" w:hAnsi="Consolas"/>
+          <w:sz w:val="16"/>
+        </w:rPr>
+        <w:t xml:space="preserve">        own_powered = own ** self.r</w:t>
+      </w:r>
+    </w:p>
+    <w:p>
+      <w:pPr>
+        <w:spacing w:before="0" w:after="0" w:line="240" w:lineRule="auto"/>
+      </w:pPr>
+      <w:r>
+        <w:rPr>
+          <w:rFonts w:ascii="Consolas" w:hAnsi="Consolas"/>
+          <w:sz w:val="16"/>
+        </w:rPr>
+        <w:t xml:space="preserve">        total = own_powered + rivals_powered</w:t>
+      </w:r>
+    </w:p>
+    <w:p>
+      <w:pPr>
+        <w:spacing w:before="0" w:after="0" w:line="240" w:lineRule="auto"/>
+      </w:pPr>
+      <w:r>
+        <w:rPr>
+          <w:rFonts w:ascii="Consolas" w:hAnsi="Consolas"/>
+          <w:sz w:val="16"/>
+        </w:rPr>
+      </w:r>
+    </w:p>
+    <w:p>
+      <w:pPr>
+        <w:spacing w:before="0" w:after="0" w:line="240" w:lineRule="auto"/>
+      </w:pPr>
+      <w:r>
+        <w:rPr>
+          <w:rFonts w:ascii="Consolas" w:hAnsi="Consolas"/>
+          <w:sz w:val="16"/>
+        </w:rPr>
+        <w:t xml:space="preserve">        probs = np.where(total &gt; 0, own_powered / total, 1.0 / self.n)</w:t>
+      </w:r>
+    </w:p>
+    <w:p>
+      <w:pPr>
+        <w:spacing w:before="0" w:after="0" w:line="240" w:lineRule="auto"/>
+      </w:pPr>
+      <w:r>
+        <w:rPr>
+          <w:rFonts w:ascii="Consolas" w:hAnsi="Consolas"/>
+          <w:sz w:val="16"/>
+        </w:rPr>
+        <w:t xml:space="preserve">        return probs * self.valuations[player_index] - own ** self.alpha</w:t>
+      </w:r>
+    </w:p>
+    <w:p>
+      <w:pPr>
+        <w:spacing w:before="0" w:after="0" w:line="240" w:lineRule="auto"/>
+      </w:pPr>
+      <w:r>
+        <w:rPr>
+          <w:rFonts w:ascii="Consolas" w:hAnsi="Consolas"/>
+          <w:sz w:val="16"/>
+        </w:rPr>
+      </w:r>
+    </w:p>
+    <w:p>
+      <w:pPr>
+        <w:spacing w:before="0" w:after="0" w:line="240" w:lineRule="auto"/>
+      </w:pPr>
+      <w:r>
+        <w:rPr>
+          <w:rFonts w:ascii="Consolas" w:hAnsi="Consolas"/>
+          <w:sz w:val="16"/>
+        </w:rPr>
+        <w:t xml:space="preserve">    def analytical_symmetric_equilibrium(self):</w:t>
+      </w:r>
+    </w:p>
+    <w:p>
+      <w:pPr>
+        <w:spacing w:before="0" w:after="0" w:line="240" w:lineRule="auto"/>
+      </w:pPr>
+      <w:r>
+        <w:rPr>
+          <w:rFonts w:ascii="Consolas" w:hAnsi="Consolas"/>
+          <w:sz w:val="16"/>
+        </w:rPr>
+        <w:t xml:space="preserve">        """Tullock (1980) closed form, x* = V(n-1)/n^2.</w:t>
+      </w:r>
+    </w:p>
+    <w:p>
+      <w:pPr>
+        <w:spacing w:before="0" w:after="0" w:line="240" w:lineRule="auto"/>
+      </w:pPr>
+      <w:r>
+        <w:rPr>
+          <w:rFonts w:ascii="Consolas" w:hAnsi="Consolas"/>
+          <w:sz w:val="16"/>
+        </w:rPr>
+      </w:r>
+    </w:p>
+    <w:p>
+      <w:pPr>
+        <w:spacing w:before="0" w:after="0" w:line="240" w:lineRule="auto"/>
+      </w:pPr>
+      <w:r>
+        <w:rPr>
+          <w:rFonts w:ascii="Consolas" w:hAnsi="Consolas"/>
+          <w:sz w:val="16"/>
+        </w:rPr>
+        <w:t xml:space="preserve">        Only valid for equal valuations, r = 1 and linear costs.</w:t>
+      </w:r>
+    </w:p>
+    <w:p>
+      <w:pPr>
+        <w:spacing w:before="0" w:after="0" w:line="240" w:lineRule="auto"/>
+      </w:pPr>
+      <w:r>
+        <w:rPr>
+          <w:rFonts w:ascii="Consolas" w:hAnsi="Consolas"/>
+          <w:sz w:val="16"/>
+        </w:rPr>
+        <w:t xml:space="preserve">        """</w:t>
+      </w:r>
+    </w:p>
+    <w:p>
+      <w:pPr>
+        <w:spacing w:before="0" w:after="0" w:line="240" w:lineRule="auto"/>
+      </w:pPr>
+      <w:r>
+        <w:rPr>
+          <w:rFonts w:ascii="Consolas" w:hAnsi="Consolas"/>
+          <w:sz w:val="16"/>
+        </w:rPr>
+        <w:t xml:space="preserve">        if not np.allclose(self.valuations, self.valuations[0]):</w:t>
+      </w:r>
+    </w:p>
+    <w:p>
+      <w:pPr>
+        <w:spacing w:before="0" w:after="0" w:line="240" w:lineRule="auto"/>
+      </w:pPr>
+      <w:r>
+        <w:rPr>
+          <w:rFonts w:ascii="Consolas" w:hAnsi="Consolas"/>
+          <w:sz w:val="16"/>
+        </w:rPr>
+        <w:t xml:space="preserve">            raise ValueError("closed form needs equal valuations")</w:t>
+      </w:r>
+    </w:p>
+    <w:p>
+      <w:pPr>
+        <w:spacing w:before="0" w:after="0" w:line="240" w:lineRule="auto"/>
+      </w:pPr>
+      <w:r>
+        <w:rPr>
+          <w:rFonts w:ascii="Consolas" w:hAnsi="Consolas"/>
+          <w:sz w:val="16"/>
+        </w:rPr>
+        <w:t xml:space="preserve">        if self.r != 1.0:</w:t>
+      </w:r>
+    </w:p>
+    <w:p>
+      <w:pPr>
+        <w:spacing w:before="0" w:after="0" w:line="240" w:lineRule="auto"/>
+      </w:pPr>
+      <w:r>
+        <w:rPr>
+          <w:rFonts w:ascii="Consolas" w:hAnsi="Consolas"/>
+          <w:sz w:val="16"/>
+        </w:rPr>
+        <w:t xml:space="preserve">            raise ValueError("closed form needs r = 1")</w:t>
+      </w:r>
+    </w:p>
+    <w:p>
+      <w:pPr>
+        <w:spacing w:before="0" w:after="0" w:line="240" w:lineRule="auto"/>
+      </w:pPr>
+      <w:r>
+        <w:rPr>
+          <w:rFonts w:ascii="Consolas" w:hAnsi="Consolas"/>
+          <w:sz w:val="16"/>
+        </w:rPr>
+        <w:t xml:space="preserve">        if self.alpha != 1.0:</w:t>
+      </w:r>
+    </w:p>
+    <w:p>
+      <w:pPr>
+        <w:spacing w:before="0" w:after="0" w:line="240" w:lineRule="auto"/>
+      </w:pPr>
+      <w:r>
+        <w:rPr>
+          <w:rFonts w:ascii="Consolas" w:hAnsi="Consolas"/>
+          <w:sz w:val="16"/>
+        </w:rPr>
+        <w:t xml:space="preserve">            raise ValueError("closed form needs alpha = 1")</w:t>
+      </w:r>
+    </w:p>
+    <w:p>
+      <w:pPr>
+        <w:spacing w:before="0" w:after="0" w:line="240" w:lineRule="auto"/>
+      </w:pPr>
+      <w:r>
+        <w:rPr>
+          <w:rFonts w:ascii="Consolas" w:hAnsi="Consolas"/>
+          <w:sz w:val="16"/>
+        </w:rPr>
+      </w:r>
+    </w:p>
+    <w:p>
+      <w:pPr>
+        <w:spacing w:before="0" w:after="0" w:line="240" w:lineRule="auto"/>
+      </w:pPr>
+      <w:r>
+        <w:rPr>
+          <w:rFonts w:ascii="Consolas" w:hAnsi="Consolas"/>
+          <w:sz w:val="16"/>
+        </w:rPr>
+        <w:t xml:space="preserve">        V = self.valuations[0]</w:t>
+      </w:r>
+    </w:p>
+    <w:p>
+      <w:pPr>
+        <w:spacing w:before="0" w:after="0" w:line="240" w:lineRule="auto"/>
+      </w:pPr>
+      <w:r>
+        <w:rPr>
+          <w:rFonts w:ascii="Consolas" w:hAnsi="Consolas"/>
+          <w:sz w:val="16"/>
+        </w:rPr>
+        <w:t xml:space="preserve">        return V * (self.n - 1) / self.n ** 2</w:t>
+      </w:r>
+    </w:p>
+    <w:p/>
+    <w:p>
+      <w:r>
+        <w:rPr>
+          <w:rFonts w:ascii="Consolas" w:hAnsi="Consolas"/>
+          <w:b/>
+          <w:sz w:val="22"/>
+        </w:rPr>
+        <w:t>src/best_response.py</w:t>
+      </w:r>
+    </w:p>
+    <w:p>
+      <w:pPr>
+        <w:spacing w:before="0" w:after="0" w:line="240" w:lineRule="auto"/>
+      </w:pPr>
+      <w:r>
+        <w:rPr>
+          <w:rFonts w:ascii="Consolas" w:hAnsi="Consolas"/>
+          <w:sz w:val="16"/>
+        </w:rPr>
+        <w:t>"""Best response of a single player to a fixed profile of rival efforts."""</w:t>
+      </w:r>
+    </w:p>
+    <w:p>
+      <w:pPr>
+        <w:spacing w:before="0" w:after="0" w:line="240" w:lineRule="auto"/>
+      </w:pPr>
+      <w:r>
+        <w:rPr>
+          <w:rFonts w:ascii="Consolas" w:hAnsi="Consolas"/>
+          <w:sz w:val="16"/>
+        </w:rPr>
+      </w:r>
+    </w:p>
+    <w:p>
+      <w:pPr>
+        <w:spacing w:before="0" w:after="0" w:line="240" w:lineRule="auto"/>
+      </w:pPr>
+      <w:r>
+        <w:rPr>
+          <w:rFonts w:ascii="Consolas" w:hAnsi="Consolas"/>
+          <w:sz w:val="16"/>
+        </w:rPr>
+        <w:t>from functools import lru_cache</w:t>
+      </w:r>
+    </w:p>
+    <w:p>
+      <w:pPr>
+        <w:spacing w:before="0" w:after="0" w:line="240" w:lineRule="auto"/>
+      </w:pPr>
+      <w:r>
+        <w:rPr>
+          <w:rFonts w:ascii="Consolas" w:hAnsi="Consolas"/>
+          <w:sz w:val="16"/>
+        </w:rPr>
+      </w:r>
+    </w:p>
+    <w:p>
+      <w:pPr>
+        <w:spacing w:before="0" w:after="0" w:line="240" w:lineRule="auto"/>
+      </w:pPr>
+      <w:r>
+        <w:rPr>
+          <w:rFonts w:ascii="Consolas" w:hAnsi="Consolas"/>
+          <w:sz w:val="16"/>
+        </w:rPr>
+        <w:t>import numpy as np</w:t>
+      </w:r>
+    </w:p>
+    <w:p>
+      <w:pPr>
+        <w:spacing w:before="0" w:after="0" w:line="240" w:lineRule="auto"/>
+      </w:pPr>
+      <w:r>
+        <w:rPr>
+          <w:rFonts w:ascii="Consolas" w:hAnsi="Consolas"/>
+          <w:sz w:val="16"/>
+        </w:rPr>
+        <w:t>from scipy.optimize import minimize_scalar</w:t>
+      </w:r>
+    </w:p>
+    <w:p>
+      <w:pPr>
+        <w:spacing w:before="0" w:after="0" w:line="240" w:lineRule="auto"/>
+      </w:pPr>
+      <w:r>
+        <w:rPr>
+          <w:rFonts w:ascii="Consolas" w:hAnsi="Consolas"/>
+          <w:sz w:val="16"/>
+        </w:rPr>
+      </w:r>
+    </w:p>
+    <w:p>
+      <w:pPr>
+        <w:spacing w:before="0" w:after="0" w:line="240" w:lineRule="auto"/>
+      </w:pPr>
+      <w:r>
+        <w:rPr>
+          <w:rFonts w:ascii="Consolas" w:hAnsi="Consolas"/>
+          <w:sz w:val="16"/>
+        </w:rPr>
+        <w:t># Strictly positive: the success function is undefined at an all-zero profile.</w:t>
+      </w:r>
+    </w:p>
+    <w:p>
+      <w:pPr>
+        <w:spacing w:before="0" w:after="0" w:line="240" w:lineRule="auto"/>
+      </w:pPr>
+      <w:r>
+        <w:rPr>
+          <w:rFonts w:ascii="Consolas" w:hAnsi="Consolas"/>
+          <w:sz w:val="16"/>
+        </w:rPr>
+        <w:t>EFFORT_MIN = 1e-8</w:t>
+      </w:r>
+    </w:p>
+    <w:p>
+      <w:pPr>
+        <w:spacing w:before="0" w:after="0" w:line="240" w:lineRule="auto"/>
+      </w:pPr>
+      <w:r>
+        <w:rPr>
+          <w:rFonts w:ascii="Consolas" w:hAnsi="Consolas"/>
+          <w:sz w:val="16"/>
+        </w:rPr>
+      </w:r>
+    </w:p>
+    <w:p>
+      <w:pPr>
+        <w:spacing w:before="0" w:after="0" w:line="240" w:lineRule="auto"/>
+      </w:pPr>
+      <w:r>
+        <w:rPr>
+          <w:rFonts w:ascii="Consolas" w:hAnsi="Consolas"/>
+          <w:sz w:val="16"/>
+        </w:rPr>
+      </w:r>
+    </w:p>
+    <w:p>
+      <w:pPr>
+        <w:spacing w:before="0" w:after="0" w:line="240" w:lineRule="auto"/>
+      </w:pPr>
+      <w:r>
+        <w:rPr>
+          <w:rFonts w:ascii="Consolas" w:hAnsi="Consolas"/>
+          <w:sz w:val="16"/>
+        </w:rPr>
+        <w:t>def effort_ceiling(contest, player_index):</w:t>
+      </w:r>
+    </w:p>
+    <w:p>
+      <w:pPr>
+        <w:spacing w:before="0" w:after="0" w:line="240" w:lineRule="auto"/>
+      </w:pPr>
+      <w:r>
+        <w:rPr>
+          <w:rFonts w:ascii="Consolas" w:hAnsi="Consolas"/>
+          <w:sz w:val="16"/>
+        </w:rPr>
+        <w:t xml:space="preserve">    """Upper bound on player i's best response.</w:t>
+      </w:r>
+    </w:p>
+    <w:p>
+      <w:pPr>
+        <w:spacing w:before="0" w:after="0" w:line="240" w:lineRule="auto"/>
+      </w:pPr>
+      <w:r>
+        <w:rPr>
+          <w:rFonts w:ascii="Consolas" w:hAnsi="Consolas"/>
+          <w:sz w:val="16"/>
+        </w:rPr>
+      </w:r>
+    </w:p>
+    <w:p>
+      <w:pPr>
+        <w:spacing w:before="0" w:after="0" w:line="240" w:lineRule="auto"/>
+      </w:pPr>
+      <w:r>
+        <w:rPr>
+          <w:rFonts w:ascii="Consolas" w:hAnsi="Consolas"/>
+          <w:sz w:val="16"/>
+        </w:rPr>
+        <w:t xml:space="preserve">    A best response never loses money, so p_i * V_i - x^alpha &gt;= 0 at the</w:t>
+      </w:r>
+    </w:p>
+    <w:p>
+      <w:pPr>
+        <w:spacing w:before="0" w:after="0" w:line="240" w:lineRule="auto"/>
+      </w:pPr>
+      <w:r>
+        <w:rPr>
+          <w:rFonts w:ascii="Consolas" w:hAnsi="Consolas"/>
+          <w:sz w:val="16"/>
+        </w:rPr>
+        <w:t xml:space="preserve">    optimum, and p_i &lt;= 1 gives x &lt;= V_i^(1/alpha).</w:t>
+      </w:r>
+    </w:p>
+    <w:p>
+      <w:pPr>
+        <w:spacing w:before="0" w:after="0" w:line="240" w:lineRule="auto"/>
+      </w:pPr>
+      <w:r>
+        <w:rPr>
+          <w:rFonts w:ascii="Consolas" w:hAnsi="Consolas"/>
+          <w:sz w:val="16"/>
+        </w:rPr>
+        <w:t xml:space="preserve">    """</w:t>
+      </w:r>
+    </w:p>
+    <w:p>
+      <w:pPr>
+        <w:spacing w:before="0" w:after="0" w:line="240" w:lineRule="auto"/>
+      </w:pPr>
+      <w:r>
+        <w:rPr>
+          <w:rFonts w:ascii="Consolas" w:hAnsi="Consolas"/>
+          <w:sz w:val="16"/>
+        </w:rPr>
+        <w:t xml:space="preserve">    return float(contest.valuations[player_index] ** (1.0 / contest.alpha))</w:t>
+      </w:r>
+    </w:p>
+    <w:p>
+      <w:pPr>
+        <w:spacing w:before="0" w:after="0" w:line="240" w:lineRule="auto"/>
+      </w:pPr>
+      <w:r>
+        <w:rPr>
+          <w:rFonts w:ascii="Consolas" w:hAnsi="Consolas"/>
+          <w:sz w:val="16"/>
+        </w:rPr>
+      </w:r>
+    </w:p>
+    <w:p>
+      <w:pPr>
+        <w:spacing w:before="0" w:after="0" w:line="240" w:lineRule="auto"/>
+      </w:pPr>
+      <w:r>
+        <w:rPr>
+          <w:rFonts w:ascii="Consolas" w:hAnsi="Consolas"/>
+          <w:sz w:val="16"/>
+        </w:rPr>
+      </w:r>
+    </w:p>
+    <w:p>
+      <w:pPr>
+        <w:spacing w:before="0" w:after="0" w:line="240" w:lineRule="auto"/>
+      </w:pPr>
+      <w:r>
+        <w:rPr>
+          <w:rFonts w:ascii="Consolas" w:hAnsi="Consolas"/>
+          <w:sz w:val="16"/>
+        </w:rPr>
+        <w:t>@lru_cache(maxsize=64)</w:t>
+      </w:r>
+    </w:p>
+    <w:p>
+      <w:pPr>
+        <w:spacing w:before="0" w:after="0" w:line="240" w:lineRule="auto"/>
+      </w:pPr>
+      <w:r>
+        <w:rPr>
+          <w:rFonts w:ascii="Consolas" w:hAnsi="Consolas"/>
+          <w:sz w:val="16"/>
+        </w:rPr>
+        <w:t>def _scan_grid(x_min, x_max, n_log=160, n_linear=160):</w:t>
+      </w:r>
+    </w:p>
+    <w:p>
+      <w:pPr>
+        <w:spacing w:before="0" w:after="0" w:line="240" w:lineRule="auto"/>
+      </w:pPr>
+      <w:r>
+        <w:rPr>
+          <w:rFonts w:ascii="Consolas" w:hAnsi="Consolas"/>
+          <w:sz w:val="16"/>
+        </w:rPr>
+        <w:t xml:space="preserve">    """Candidate efforts used to bracket the global maximum."""</w:t>
+      </w:r>
+    </w:p>
+    <w:p>
+      <w:pPr>
+        <w:spacing w:before="0" w:after="0" w:line="240" w:lineRule="auto"/>
+      </w:pPr>
+      <w:r>
+        <w:rPr>
+          <w:rFonts w:ascii="Consolas" w:hAnsi="Consolas"/>
+          <w:sz w:val="16"/>
+        </w:rPr>
+        <w:t xml:space="preserve">    return np.unique(np.concatenate([</w:t>
+      </w:r>
+    </w:p>
+    <w:p>
+      <w:pPr>
+        <w:spacing w:before="0" w:after="0" w:line="240" w:lineRule="auto"/>
+      </w:pPr>
+      <w:r>
+        <w:rPr>
+          <w:rFonts w:ascii="Consolas" w:hAnsi="Consolas"/>
+          <w:sz w:val="16"/>
+        </w:rPr>
+        <w:t xml:space="preserve">        np.geomspace(x_min, x_max, n_log),</w:t>
+      </w:r>
+    </w:p>
+    <w:p>
+      <w:pPr>
+        <w:spacing w:before="0" w:after="0" w:line="240" w:lineRule="auto"/>
+      </w:pPr>
+      <w:r>
+        <w:rPr>
+          <w:rFonts w:ascii="Consolas" w:hAnsi="Consolas"/>
+          <w:sz w:val="16"/>
+        </w:rPr>
+        <w:t xml:space="preserve">        np.linspace(x_min, x_max, n_linear),</w:t>
+      </w:r>
+    </w:p>
+    <w:p>
+      <w:pPr>
+        <w:spacing w:before="0" w:after="0" w:line="240" w:lineRule="auto"/>
+      </w:pPr>
+      <w:r>
+        <w:rPr>
+          <w:rFonts w:ascii="Consolas" w:hAnsi="Consolas"/>
+          <w:sz w:val="16"/>
+        </w:rPr>
+        <w:t xml:space="preserve">    ]))</w:t>
+      </w:r>
+    </w:p>
+    <w:p>
+      <w:pPr>
+        <w:spacing w:before="0" w:after="0" w:line="240" w:lineRule="auto"/>
+      </w:pPr>
+      <w:r>
+        <w:rPr>
+          <w:rFonts w:ascii="Consolas" w:hAnsi="Consolas"/>
+          <w:sz w:val="16"/>
+        </w:rPr>
+      </w:r>
+    </w:p>
+    <w:p>
+      <w:pPr>
+        <w:spacing w:before="0" w:after="0" w:line="240" w:lineRule="auto"/>
+      </w:pPr>
+      <w:r>
+        <w:rPr>
+          <w:rFonts w:ascii="Consolas" w:hAnsi="Consolas"/>
+          <w:sz w:val="16"/>
+        </w:rPr>
+      </w:r>
+    </w:p>
+    <w:p>
+      <w:pPr>
+        <w:spacing w:before="0" w:after="0" w:line="240" w:lineRule="auto"/>
+      </w:pPr>
+      <w:r>
+        <w:rPr>
+          <w:rFonts w:ascii="Consolas" w:hAnsi="Consolas"/>
+          <w:sz w:val="16"/>
+        </w:rPr>
+        <w:t>def compute_best_response(contest, player_index, others_efforts,</w:t>
+      </w:r>
+    </w:p>
+    <w:p>
+      <w:pPr>
+        <w:spacing w:before="0" w:after="0" w:line="240" w:lineRule="auto"/>
+      </w:pPr>
+      <w:r>
+        <w:rPr>
+          <w:rFonts w:ascii="Consolas" w:hAnsi="Consolas"/>
+          <w:sz w:val="16"/>
+        </w:rPr>
+        <w:t xml:space="preserve">                          x_min=EFFORT_MIN, x_max=None):</w:t>
+      </w:r>
+    </w:p>
+    <w:p>
+      <w:pPr>
+        <w:spacing w:before="0" w:after="0" w:line="240" w:lineRule="auto"/>
+      </w:pPr>
+      <w:r>
+        <w:rPr>
+          <w:rFonts w:ascii="Consolas" w:hAnsi="Consolas"/>
+          <w:sz w:val="16"/>
+        </w:rPr>
+        <w:t xml:space="preserve">    """Effort maximising player i's payoff with rivals' efforts held fixed.</w:t>
+      </w:r>
+    </w:p>
+    <w:p>
+      <w:pPr>
+        <w:spacing w:before="0" w:after="0" w:line="240" w:lineRule="auto"/>
+      </w:pPr>
+      <w:r>
+        <w:rPr>
+          <w:rFonts w:ascii="Consolas" w:hAnsi="Consolas"/>
+          <w:sz w:val="16"/>
+        </w:rPr>
+      </w:r>
+    </w:p>
+    <w:p>
+      <w:pPr>
+        <w:spacing w:before="0" w:after="0" w:line="240" w:lineRule="auto"/>
+      </w:pPr>
+      <w:r>
+        <w:rPr>
+          <w:rFonts w:ascii="Consolas" w:hAnsi="Consolas"/>
+          <w:sz w:val="16"/>
+        </w:rPr>
+        <w:t xml:space="preserve">    For r &gt; 1 the payoff is not concave in own effort: a local maximum near</w:t>
+      </w:r>
+    </w:p>
+    <w:p>
+      <w:pPr>
+        <w:spacing w:before="0" w:after="0" w:line="240" w:lineRule="auto"/>
+      </w:pPr>
+      <w:r>
+        <w:rPr>
+          <w:rFonts w:ascii="Consolas" w:hAnsi="Consolas"/>
+          <w:sz w:val="16"/>
+        </w:rPr>
+        <w:t xml:space="preserve">    zero can sit alongside an interior one, and a unimodal search returns</w:t>
+      </w:r>
+    </w:p>
+    <w:p>
+      <w:pPr>
+        <w:spacing w:before="0" w:after="0" w:line="240" w:lineRule="auto"/>
+      </w:pPr>
+      <w:r>
+        <w:rPr>
+          <w:rFonts w:ascii="Consolas" w:hAnsi="Consolas"/>
+          <w:sz w:val="16"/>
+        </w:rPr>
+        <w:t xml:space="preserve">    whichever it happens to land in. So the interval is scanned first to</w:t>
+      </w:r>
+    </w:p>
+    <w:p>
+      <w:pPr>
+        <w:spacing w:before="0" w:after="0" w:line="240" w:lineRule="auto"/>
+      </w:pPr>
+      <w:r>
+        <w:rPr>
+          <w:rFonts w:ascii="Consolas" w:hAnsi="Consolas"/>
+          <w:sz w:val="16"/>
+        </w:rPr>
+        <w:t xml:space="preserve">    find the right basin, then refined inside it.</w:t>
+      </w:r>
+    </w:p>
+    <w:p>
+      <w:pPr>
+        <w:spacing w:before="0" w:after="0" w:line="240" w:lineRule="auto"/>
+      </w:pPr>
+      <w:r>
+        <w:rPr>
+          <w:rFonts w:ascii="Consolas" w:hAnsi="Consolas"/>
+          <w:sz w:val="16"/>
+        </w:rPr>
+        <w:t xml:space="preserve">    """</w:t>
+      </w:r>
+    </w:p>
+    <w:p>
+      <w:pPr>
+        <w:spacing w:before="0" w:after="0" w:line="240" w:lineRule="auto"/>
+      </w:pPr>
+      <w:r>
+        <w:rPr>
+          <w:rFonts w:ascii="Consolas" w:hAnsi="Consolas"/>
+          <w:sz w:val="16"/>
+        </w:rPr>
+        <w:t xml:space="preserve">    others_efforts = np.asarray(others_efforts, dtype=float)</w:t>
+      </w:r>
+    </w:p>
+    <w:p>
+      <w:pPr>
+        <w:spacing w:before="0" w:after="0" w:line="240" w:lineRule="auto"/>
+      </w:pPr>
+      <w:r>
+        <w:rPr>
+          <w:rFonts w:ascii="Consolas" w:hAnsi="Consolas"/>
+          <w:sz w:val="16"/>
+        </w:rPr>
+        <w:t xml:space="preserve">    if x_max is None:</w:t>
+      </w:r>
+    </w:p>
+    <w:p>
+      <w:pPr>
+        <w:spacing w:before="0" w:after="0" w:line="240" w:lineRule="auto"/>
+      </w:pPr>
+      <w:r>
+        <w:rPr>
+          <w:rFonts w:ascii="Consolas" w:hAnsi="Consolas"/>
+          <w:sz w:val="16"/>
+        </w:rPr>
+        <w:t xml:space="preserve">        x_max = effort_ceiling(contest, player_index)</w:t>
+      </w:r>
+    </w:p>
+    <w:p>
+      <w:pPr>
+        <w:spacing w:before="0" w:after="0" w:line="240" w:lineRule="auto"/>
+      </w:pPr>
+      <w:r>
+        <w:rPr>
+          <w:rFonts w:ascii="Consolas" w:hAnsi="Consolas"/>
+          <w:sz w:val="16"/>
+        </w:rPr>
+      </w:r>
+    </w:p>
+    <w:p>
+      <w:pPr>
+        <w:spacing w:before="0" w:after="0" w:line="240" w:lineRule="auto"/>
+      </w:pPr>
+      <w:r>
+        <w:rPr>
+          <w:rFonts w:ascii="Consolas" w:hAnsi="Consolas"/>
+          <w:sz w:val="16"/>
+        </w:rPr>
+        <w:t xml:space="preserve">    grid = _scan_grid(x_min, x_max)</w:t>
+      </w:r>
+    </w:p>
+    <w:p>
+      <w:pPr>
+        <w:spacing w:before="0" w:after="0" w:line="240" w:lineRule="auto"/>
+      </w:pPr>
+      <w:r>
+        <w:rPr>
+          <w:rFonts w:ascii="Consolas" w:hAnsi="Consolas"/>
+          <w:sz w:val="16"/>
+        </w:rPr>
+        <w:t xml:space="preserve">    payoffs = contest.own_payoff_curve(player_index, others_efforts, grid)</w:t>
+      </w:r>
+    </w:p>
+    <w:p>
+      <w:pPr>
+        <w:spacing w:before="0" w:after="0" w:line="240" w:lineRule="auto"/>
+      </w:pPr>
+      <w:r>
+        <w:rPr>
+          <w:rFonts w:ascii="Consolas" w:hAnsi="Consolas"/>
+          <w:sz w:val="16"/>
+        </w:rPr>
+        <w:t xml:space="preserve">    best = int(np.argmax(payoffs))</w:t>
+      </w:r>
+    </w:p>
+    <w:p>
+      <w:pPr>
+        <w:spacing w:before="0" w:after="0" w:line="240" w:lineRule="auto"/>
+      </w:pPr>
+      <w:r>
+        <w:rPr>
+          <w:rFonts w:ascii="Consolas" w:hAnsi="Consolas"/>
+          <w:sz w:val="16"/>
+        </w:rPr>
+      </w:r>
+    </w:p>
+    <w:p>
+      <w:pPr>
+        <w:spacing w:before="0" w:after="0" w:line="240" w:lineRule="auto"/>
+      </w:pPr>
+      <w:r>
+        <w:rPr>
+          <w:rFonts w:ascii="Consolas" w:hAnsi="Consolas"/>
+          <w:sz w:val="16"/>
+        </w:rPr>
+        <w:t xml:space="preserve">    lower = grid[best - 1] if best &gt; 0 else grid[0]</w:t>
+      </w:r>
+    </w:p>
+    <w:p>
+      <w:pPr>
+        <w:spacing w:before="0" w:after="0" w:line="240" w:lineRule="auto"/>
+      </w:pPr>
+      <w:r>
+        <w:rPr>
+          <w:rFonts w:ascii="Consolas" w:hAnsi="Consolas"/>
+          <w:sz w:val="16"/>
+        </w:rPr>
+        <w:t xml:space="preserve">    upper = grid[best + 1] if best &lt; len(grid) - 1 else grid[-1]</w:t>
+      </w:r>
+    </w:p>
+    <w:p>
+      <w:pPr>
+        <w:spacing w:before="0" w:after="0" w:line="240" w:lineRule="auto"/>
+      </w:pPr>
+      <w:r>
+        <w:rPr>
+          <w:rFonts w:ascii="Consolas" w:hAnsi="Consolas"/>
+          <w:sz w:val="16"/>
+        </w:rPr>
+        <w:t xml:space="preserve">    if upper &lt;= lower:</w:t>
+      </w:r>
+    </w:p>
+    <w:p>
+      <w:pPr>
+        <w:spacing w:before="0" w:after="0" w:line="240" w:lineRule="auto"/>
+      </w:pPr>
+      <w:r>
+        <w:rPr>
+          <w:rFonts w:ascii="Consolas" w:hAnsi="Consolas"/>
+          <w:sz w:val="16"/>
+        </w:rPr>
+        <w:t xml:space="preserve">        return float(grid[best])</w:t>
+      </w:r>
+    </w:p>
+    <w:p>
+      <w:pPr>
+        <w:spacing w:before="0" w:after="0" w:line="240" w:lineRule="auto"/>
+      </w:pPr>
+      <w:r>
+        <w:rPr>
+          <w:rFonts w:ascii="Consolas" w:hAnsi="Consolas"/>
+          <w:sz w:val="16"/>
+        </w:rPr>
+      </w:r>
+    </w:p>
+    <w:p>
+      <w:pPr>
+        <w:spacing w:before="0" w:after="0" w:line="240" w:lineRule="auto"/>
+      </w:pPr>
+      <w:r>
+        <w:rPr>
+          <w:rFonts w:ascii="Consolas" w:hAnsi="Consolas"/>
+          <w:sz w:val="16"/>
+        </w:rPr>
+        <w:t xml:space="preserve">    # Written out as a scalar rather than going through contest.payoff, which</w:t>
+      </w:r>
+    </w:p>
+    <w:p>
+      <w:pPr>
+        <w:spacing w:before="0" w:after="0" w:line="240" w:lineRule="auto"/>
+      </w:pPr>
+      <w:r>
+        <w:rPr>
+          <w:rFonts w:ascii="Consolas" w:hAnsi="Consolas"/>
+          <w:sz w:val="16"/>
+        </w:rPr>
+        <w:t xml:space="preserve">    # would rebuild the whole effort vector on each of Brent's evaluations.</w:t>
+      </w:r>
+    </w:p>
+    <w:p>
+      <w:pPr>
+        <w:spacing w:before="0" w:after="0" w:line="240" w:lineRule="auto"/>
+      </w:pPr>
+      <w:r>
+        <w:rPr>
+          <w:rFonts w:ascii="Consolas" w:hAnsi="Consolas"/>
+          <w:sz w:val="16"/>
+        </w:rPr>
+        <w:t xml:space="preserve">    rivals_powered = float(np.sum(others_efforts ** contest.r))</w:t>
+      </w:r>
+    </w:p>
+    <w:p>
+      <w:pPr>
+        <w:spacing w:before="0" w:after="0" w:line="240" w:lineRule="auto"/>
+      </w:pPr>
+      <w:r>
+        <w:rPr>
+          <w:rFonts w:ascii="Consolas" w:hAnsi="Consolas"/>
+          <w:sz w:val="16"/>
+        </w:rPr>
+        <w:t xml:space="preserve">    valuation = float(contest.valuations[player_index])</w:t>
+      </w:r>
+    </w:p>
+    <w:p>
+      <w:pPr>
+        <w:spacing w:before="0" w:after="0" w:line="240" w:lineRule="auto"/>
+      </w:pPr>
+      <w:r>
+        <w:rPr>
+          <w:rFonts w:ascii="Consolas" w:hAnsi="Consolas"/>
+          <w:sz w:val="16"/>
+        </w:rPr>
+        <w:t xml:space="preserve">    r, alpha, n = contest.r, contest.alpha, contest.n</w:t>
+      </w:r>
+    </w:p>
+    <w:p>
+      <w:pPr>
+        <w:spacing w:before="0" w:after="0" w:line="240" w:lineRule="auto"/>
+      </w:pPr>
+      <w:r>
+        <w:rPr>
+          <w:rFonts w:ascii="Consolas" w:hAnsi="Consolas"/>
+          <w:sz w:val="16"/>
+        </w:rPr>
+      </w:r>
+    </w:p>
+    <w:p>
+      <w:pPr>
+        <w:spacing w:before="0" w:after="0" w:line="240" w:lineRule="auto"/>
+      </w:pPr>
+      <w:r>
+        <w:rPr>
+          <w:rFonts w:ascii="Consolas" w:hAnsi="Consolas"/>
+          <w:sz w:val="16"/>
+        </w:rPr>
+        <w:t xml:space="preserve">    def negative_payoff(x):</w:t>
+      </w:r>
+    </w:p>
+    <w:p>
+      <w:pPr>
+        <w:spacing w:before="0" w:after="0" w:line="240" w:lineRule="auto"/>
+      </w:pPr>
+      <w:r>
+        <w:rPr>
+          <w:rFonts w:ascii="Consolas" w:hAnsi="Consolas"/>
+          <w:sz w:val="16"/>
+        </w:rPr>
+        <w:t xml:space="preserve">        own_powered = x ** r</w:t>
+      </w:r>
+    </w:p>
+    <w:p>
+      <w:pPr>
+        <w:spacing w:before="0" w:after="0" w:line="240" w:lineRule="auto"/>
+      </w:pPr>
+      <w:r>
+        <w:rPr>
+          <w:rFonts w:ascii="Consolas" w:hAnsi="Consolas"/>
+          <w:sz w:val="16"/>
+        </w:rPr>
+        <w:t xml:space="preserve">        total = own_powered + rivals_powered</w:t>
+      </w:r>
+    </w:p>
+    <w:p>
+      <w:pPr>
+        <w:spacing w:before="0" w:after="0" w:line="240" w:lineRule="auto"/>
+      </w:pPr>
+      <w:r>
+        <w:rPr>
+          <w:rFonts w:ascii="Consolas" w:hAnsi="Consolas"/>
+          <w:sz w:val="16"/>
+        </w:rPr>
+        <w:t xml:space="preserve">        probability = own_powered / total if total &gt; 0 else 1.0 / n</w:t>
+      </w:r>
+    </w:p>
+    <w:p>
+      <w:pPr>
+        <w:spacing w:before="0" w:after="0" w:line="240" w:lineRule="auto"/>
+      </w:pPr>
+      <w:r>
+        <w:rPr>
+          <w:rFonts w:ascii="Consolas" w:hAnsi="Consolas"/>
+          <w:sz w:val="16"/>
+        </w:rPr>
+        <w:t xml:space="preserve">        return -(probability * valuation - x ** alpha)</w:t>
+      </w:r>
+    </w:p>
+    <w:p>
+      <w:pPr>
+        <w:spacing w:before="0" w:after="0" w:line="240" w:lineRule="auto"/>
+      </w:pPr>
+      <w:r>
+        <w:rPr>
+          <w:rFonts w:ascii="Consolas" w:hAnsi="Consolas"/>
+          <w:sz w:val="16"/>
+        </w:rPr>
+      </w:r>
+    </w:p>
+    <w:p>
+      <w:pPr>
+        <w:spacing w:before="0" w:after="0" w:line="240" w:lineRule="auto"/>
+      </w:pPr>
+      <w:r>
+        <w:rPr>
+          <w:rFonts w:ascii="Consolas" w:hAnsi="Consolas"/>
+          <w:sz w:val="16"/>
+        </w:rPr>
+        <w:t xml:space="preserve">    refined = minimize_scalar(negative_payoff, bounds=(lower, upper),</w:t>
+      </w:r>
+    </w:p>
+    <w:p>
+      <w:pPr>
+        <w:spacing w:before="0" w:after="0" w:line="240" w:lineRule="auto"/>
+      </w:pPr>
+      <w:r>
+        <w:rPr>
+          <w:rFonts w:ascii="Consolas" w:hAnsi="Consolas"/>
+          <w:sz w:val="16"/>
+        </w:rPr>
+        <w:t xml:space="preserve">                              method="bounded", options={"xatol": 1e-10})</w:t>
+      </w:r>
+    </w:p>
+    <w:p>
+      <w:pPr>
+        <w:spacing w:before="0" w:after="0" w:line="240" w:lineRule="auto"/>
+      </w:pPr>
+      <w:r>
+        <w:rPr>
+          <w:rFonts w:ascii="Consolas" w:hAnsi="Consolas"/>
+          <w:sz w:val="16"/>
+        </w:rPr>
+      </w:r>
+    </w:p>
+    <w:p>
+      <w:pPr>
+        <w:spacing w:before="0" w:after="0" w:line="240" w:lineRule="auto"/>
+      </w:pPr>
+      <w:r>
+        <w:rPr>
+          <w:rFonts w:ascii="Consolas" w:hAnsi="Consolas"/>
+          <w:sz w:val="16"/>
+        </w:rPr>
+        <w:t xml:space="preserve">    if -refined.fun &gt;= payoffs[best]:</w:t>
+      </w:r>
+    </w:p>
+    <w:p>
+      <w:pPr>
+        <w:spacing w:before="0" w:after="0" w:line="240" w:lineRule="auto"/>
+      </w:pPr>
+      <w:r>
+        <w:rPr>
+          <w:rFonts w:ascii="Consolas" w:hAnsi="Consolas"/>
+          <w:sz w:val="16"/>
+        </w:rPr>
+        <w:t xml:space="preserve">        return float(refined.x)</w:t>
+      </w:r>
+    </w:p>
+    <w:p>
+      <w:pPr>
+        <w:spacing w:before="0" w:after="0" w:line="240" w:lineRule="auto"/>
+      </w:pPr>
+      <w:r>
+        <w:rPr>
+          <w:rFonts w:ascii="Consolas" w:hAnsi="Consolas"/>
+          <w:sz w:val="16"/>
+        </w:rPr>
+        <w:t xml:space="preserve">    return float(grid[best])</w:t>
+      </w:r>
+    </w:p>
+    <w:p>
+      <w:pPr>
+        <w:spacing w:before="0" w:after="0" w:line="240" w:lineRule="auto"/>
+      </w:pPr>
+      <w:r>
+        <w:rPr>
+          <w:rFonts w:ascii="Consolas" w:hAnsi="Consolas"/>
+          <w:sz w:val="16"/>
+        </w:rPr>
+      </w:r>
+    </w:p>
+    <w:p>
+      <w:pPr>
+        <w:spacing w:before="0" w:after="0" w:line="240" w:lineRule="auto"/>
+      </w:pPr>
+      <w:r>
+        <w:rPr>
+          <w:rFonts w:ascii="Consolas" w:hAnsi="Consolas"/>
+          <w:sz w:val="16"/>
+        </w:rPr>
+      </w:r>
+    </w:p>
+    <w:p>
+      <w:pPr>
+        <w:spacing w:before="0" w:after="0" w:line="240" w:lineRule="auto"/>
+      </w:pPr>
+      <w:r>
+        <w:rPr>
+          <w:rFonts w:ascii="Consolas" w:hAnsi="Consolas"/>
+          <w:sz w:val="16"/>
+        </w:rPr>
+        <w:t>def compute_all_best_responses(contest, efforts):</w:t>
+      </w:r>
+    </w:p>
+    <w:p>
+      <w:pPr>
+        <w:spacing w:before="0" w:after="0" w:line="240" w:lineRule="auto"/>
+      </w:pPr>
+      <w:r>
+        <w:rPr>
+          <w:rFonts w:ascii="Consolas" w:hAnsi="Consolas"/>
+          <w:sz w:val="16"/>
+        </w:rPr>
+        <w:t xml:space="preserve">    """Best response for every player against the current profile."""</w:t>
+      </w:r>
+    </w:p>
+    <w:p>
+      <w:pPr>
+        <w:spacing w:before="0" w:after="0" w:line="240" w:lineRule="auto"/>
+      </w:pPr>
+      <w:r>
+        <w:rPr>
+          <w:rFonts w:ascii="Consolas" w:hAnsi="Consolas"/>
+          <w:sz w:val="16"/>
+        </w:rPr>
+        <w:t xml:space="preserve">    return np.array([</w:t>
+      </w:r>
+    </w:p>
+    <w:p>
+      <w:pPr>
+        <w:spacing w:before="0" w:after="0" w:line="240" w:lineRule="auto"/>
+      </w:pPr>
+      <w:r>
+        <w:rPr>
+          <w:rFonts w:ascii="Consolas" w:hAnsi="Consolas"/>
+          <w:sz w:val="16"/>
+        </w:rPr>
+        <w:t xml:space="preserve">        compute_best_response(contest, i, np.delete(efforts, i))</w:t>
+      </w:r>
+    </w:p>
+    <w:p>
+      <w:pPr>
+        <w:spacing w:before="0" w:after="0" w:line="240" w:lineRule="auto"/>
+      </w:pPr>
+      <w:r>
+        <w:rPr>
+          <w:rFonts w:ascii="Consolas" w:hAnsi="Consolas"/>
+          <w:sz w:val="16"/>
+        </w:rPr>
+        <w:t xml:space="preserve">        for i in range(contest.n)</w:t>
+      </w:r>
+    </w:p>
+    <w:p>
+      <w:pPr>
+        <w:spacing w:before="0" w:after="0" w:line="240" w:lineRule="auto"/>
+      </w:pPr>
+      <w:r>
+        <w:rPr>
+          <w:rFonts w:ascii="Consolas" w:hAnsi="Consolas"/>
+          <w:sz w:val="16"/>
+        </w:rPr>
+        <w:t xml:space="preserve">    ])</w:t>
+      </w:r>
+    </w:p>
+    <w:p/>
+    <w:p>
+      <w:r>
+        <w:rPr>
+          <w:rFonts w:ascii="Consolas" w:hAnsi="Consolas"/>
+          <w:b/>
+          <w:sz w:val="22"/>
+        </w:rPr>
+        <w:t>src/dynamics.py</w:t>
+      </w:r>
+    </w:p>
+    <w:p>
+      <w:pPr>
+        <w:spacing w:before="0" w:after="0" w:line="240" w:lineRule="auto"/>
+      </w:pPr>
+      <w:r>
+        <w:rPr>
+          <w:rFonts w:ascii="Consolas" w:hAnsi="Consolas"/>
+          <w:sz w:val="16"/>
+        </w:rPr>
+        <w:t>"""Best response dynamics under three update rules.</w:t>
+      </w:r>
+    </w:p>
+    <w:p>
+      <w:pPr>
+        <w:spacing w:before="0" w:after="0" w:line="240" w:lineRule="auto"/>
+      </w:pPr>
+      <w:r>
+        <w:rPr>
+          <w:rFonts w:ascii="Consolas" w:hAnsi="Consolas"/>
+          <w:sz w:val="16"/>
+        </w:rPr>
+      </w:r>
+    </w:p>
+    <w:p>
+      <w:pPr>
+        <w:spacing w:before="0" w:after="0" w:line="240" w:lineRule="auto"/>
+      </w:pPr>
+      <w:r>
+        <w:rPr>
+          <w:rFonts w:ascii="Consolas" w:hAnsi="Consolas"/>
+          <w:sz w:val="16"/>
+        </w:rPr>
+        <w:t xml:space="preserve">    synchronous   everyone jumps to their best response at once</w:t>
+      </w:r>
+    </w:p>
+    <w:p>
+      <w:pPr>
+        <w:spacing w:before="0" w:after="0" w:line="240" w:lineRule="auto"/>
+      </w:pPr>
+      <w:r>
+        <w:rPr>
+          <w:rFonts w:ascii="Consolas" w:hAnsi="Consolas"/>
+          <w:sz w:val="16"/>
+        </w:rPr>
+        <w:t xml:space="preserve">    asynchronous  players update in turn, seeing the updates before them</w:t>
+      </w:r>
+    </w:p>
+    <w:p>
+      <w:pPr>
+        <w:spacing w:before="0" w:after="0" w:line="240" w:lineRule="auto"/>
+      </w:pPr>
+      <w:r>
+        <w:rPr>
+          <w:rFonts w:ascii="Consolas" w:hAnsi="Consolas"/>
+          <w:sz w:val="16"/>
+        </w:rPr>
+        <w:t xml:space="preserve">    inertial      players move a fraction lam of the way there</w:t>
+      </w:r>
+    </w:p>
+    <w:p>
+      <w:pPr>
+        <w:spacing w:before="0" w:after="0" w:line="240" w:lineRule="auto"/>
+      </w:pPr>
+      <w:r>
+        <w:rPr>
+          <w:rFonts w:ascii="Consolas" w:hAnsi="Consolas"/>
+          <w:sz w:val="16"/>
+        </w:rPr>
+      </w:r>
+    </w:p>
+    <w:p>
+      <w:pPr>
+        <w:spacing w:before="0" w:after="0" w:line="240" w:lineRule="auto"/>
+      </w:pPr>
+      <w:r>
+        <w:rPr>
+          <w:rFonts w:ascii="Consolas" w:hAnsi="Consolas"/>
+          <w:sz w:val="16"/>
+        </w:rPr>
+        <w:t>All three return the same dict: trajectory, converged, iterations,</w:t>
+      </w:r>
+    </w:p>
+    <w:p>
+      <w:pPr>
+        <w:spacing w:before="0" w:after="0" w:line="240" w:lineRule="auto"/>
+      </w:pPr>
+      <w:r>
+        <w:rPr>
+          <w:rFonts w:ascii="Consolas" w:hAnsi="Consolas"/>
+          <w:sz w:val="16"/>
+        </w:rPr>
+        <w:t>final_efforts.</w:t>
+      </w:r>
+    </w:p>
+    <w:p>
+      <w:pPr>
+        <w:spacing w:before="0" w:after="0" w:line="240" w:lineRule="auto"/>
+      </w:pPr>
+      <w:r>
+        <w:rPr>
+          <w:rFonts w:ascii="Consolas" w:hAnsi="Consolas"/>
+          <w:sz w:val="16"/>
+        </w:rPr>
+      </w:r>
+    </w:p>
+    <w:p>
+      <w:pPr>
+        <w:spacing w:before="0" w:after="0" w:line="240" w:lineRule="auto"/>
+      </w:pPr>
+      <w:r>
+        <w:rPr>
+          <w:rFonts w:ascii="Consolas" w:hAnsi="Consolas"/>
+          <w:sz w:val="16"/>
+        </w:rPr>
+        <w:t>A run counts as converged when the profile it reached is a fixed point of</w:t>
+      </w:r>
+    </w:p>
+    <w:p>
+      <w:pPr>
+        <w:spacing w:before="0" w:after="0" w:line="240" w:lineRule="auto"/>
+      </w:pPr>
+      <w:r>
+        <w:rPr>
+          <w:rFonts w:ascii="Consolas" w:hAnsi="Consolas"/>
+          <w:sz w:val="16"/>
+        </w:rPr>
+        <w:t>the best response map. A small last step is not enough on its own: efforts</w:t>
+      </w:r>
+    </w:p>
+    <w:p>
+      <w:pPr>
+        <w:spacing w:before="0" w:after="0" w:line="240" w:lineRule="auto"/>
+      </w:pPr>
+      <w:r>
+        <w:rPr>
+          <w:rFonts w:ascii="Consolas" w:hAnsi="Consolas"/>
+          <w:sz w:val="16"/>
+        </w:rPr>
+        <w:t>collapsing towards the lower bound take tiny steps while sitting nowhere</w:t>
+      </w:r>
+    </w:p>
+    <w:p>
+      <w:pPr>
+        <w:spacing w:before="0" w:after="0" w:line="240" w:lineRule="auto"/>
+      </w:pPr>
+      <w:r>
+        <w:rPr>
+          <w:rFonts w:ascii="Consolas" w:hAnsi="Consolas"/>
+          <w:sz w:val="16"/>
+        </w:rPr>
+        <w:t>near an equilibrium. Since x = (1-lam)x + lam*BR(x) exactly when x = BR(x),</w:t>
+      </w:r>
+    </w:p>
+    <w:p>
+      <w:pPr>
+        <w:spacing w:before="0" w:after="0" w:line="240" w:lineRule="auto"/>
+      </w:pPr>
+      <w:r>
+        <w:rPr>
+          <w:rFonts w:ascii="Consolas" w:hAnsi="Consolas"/>
+          <w:sz w:val="16"/>
+        </w:rPr>
+        <w:t>the same test works for all three rules.</w:t>
+      </w:r>
+    </w:p>
+    <w:p>
+      <w:pPr>
+        <w:spacing w:before="0" w:after="0" w:line="240" w:lineRule="auto"/>
+      </w:pPr>
+      <w:r>
+        <w:rPr>
+          <w:rFonts w:ascii="Consolas" w:hAnsi="Consolas"/>
+          <w:sz w:val="16"/>
+        </w:rPr>
+        <w:t>"""</w:t>
+      </w:r>
+    </w:p>
+    <w:p>
+      <w:pPr>
+        <w:spacing w:before="0" w:after="0" w:line="240" w:lineRule="auto"/>
+      </w:pPr>
+      <w:r>
+        <w:rPr>
+          <w:rFonts w:ascii="Consolas" w:hAnsi="Consolas"/>
+          <w:sz w:val="16"/>
+        </w:rPr>
+      </w:r>
+    </w:p>
+    <w:p>
+      <w:pPr>
+        <w:spacing w:before="0" w:after="0" w:line="240" w:lineRule="auto"/>
+      </w:pPr>
+      <w:r>
+        <w:rPr>
+          <w:rFonts w:ascii="Consolas" w:hAnsi="Consolas"/>
+          <w:sz w:val="16"/>
+        </w:rPr>
+        <w:t>import numpy as np</w:t>
+      </w:r>
+    </w:p>
+    <w:p>
+      <w:pPr>
+        <w:spacing w:before="0" w:after="0" w:line="240" w:lineRule="auto"/>
+      </w:pPr>
+      <w:r>
+        <w:rPr>
+          <w:rFonts w:ascii="Consolas" w:hAnsi="Consolas"/>
+          <w:sz w:val="16"/>
+        </w:rPr>
+      </w:r>
+    </w:p>
+    <w:p>
+      <w:pPr>
+        <w:spacing w:before="0" w:after="0" w:line="240" w:lineRule="auto"/>
+      </w:pPr>
+      <w:r>
+        <w:rPr>
+          <w:rFonts w:ascii="Consolas" w:hAnsi="Consolas"/>
+          <w:sz w:val="16"/>
+        </w:rPr>
+        <w:t>from src.best_response import compute_best_response, compute_all_best_responses</w:t>
+      </w:r>
+    </w:p>
+    <w:p>
+      <w:pPr>
+        <w:spacing w:before="0" w:after="0" w:line="240" w:lineRule="auto"/>
+      </w:pPr>
+      <w:r>
+        <w:rPr>
+          <w:rFonts w:ascii="Consolas" w:hAnsi="Consolas"/>
+          <w:sz w:val="16"/>
+        </w:rPr>
+      </w:r>
+    </w:p>
+    <w:p>
+      <w:pPr>
+        <w:spacing w:before="0" w:after="0" w:line="240" w:lineRule="auto"/>
+      </w:pPr>
+      <w:r>
+        <w:rPr>
+          <w:rFonts w:ascii="Consolas" w:hAnsi="Consolas"/>
+          <w:sz w:val="16"/>
+        </w:rPr>
+      </w:r>
+    </w:p>
+    <w:p>
+      <w:pPr>
+        <w:spacing w:before="0" w:after="0" w:line="240" w:lineRule="auto"/>
+      </w:pPr>
+      <w:r>
+        <w:rPr>
+          <w:rFonts w:ascii="Consolas" w:hAnsi="Consolas"/>
+          <w:sz w:val="16"/>
+        </w:rPr>
+        <w:t>def _at_fixed_point(contest, efforts, tolerance):</w:t>
+      </w:r>
+    </w:p>
+    <w:p>
+      <w:pPr>
+        <w:spacing w:before="0" w:after="0" w:line="240" w:lineRule="auto"/>
+      </w:pPr>
+      <w:r>
+        <w:rPr>
+          <w:rFonts w:ascii="Consolas" w:hAnsi="Consolas"/>
+          <w:sz w:val="16"/>
+        </w:rPr>
+        <w:t xml:space="preserve">    residual = compute_all_best_responses(contest, efforts) - efforts</w:t>
+      </w:r>
+    </w:p>
+    <w:p>
+      <w:pPr>
+        <w:spacing w:before="0" w:after="0" w:line="240" w:lineRule="auto"/>
+      </w:pPr>
+      <w:r>
+        <w:rPr>
+          <w:rFonts w:ascii="Consolas" w:hAnsi="Consolas"/>
+          <w:sz w:val="16"/>
+        </w:rPr>
+        <w:t xml:space="preserve">    return np.max(np.abs(residual)) &lt; tolerance</w:t>
+      </w:r>
+    </w:p>
+    <w:p>
+      <w:pPr>
+        <w:spacing w:before="0" w:after="0" w:line="240" w:lineRule="auto"/>
+      </w:pPr>
+      <w:r>
+        <w:rPr>
+          <w:rFonts w:ascii="Consolas" w:hAnsi="Consolas"/>
+          <w:sz w:val="16"/>
+        </w:rPr>
+      </w:r>
+    </w:p>
+    <w:p>
+      <w:pPr>
+        <w:spacing w:before="0" w:after="0" w:line="240" w:lineRule="auto"/>
+      </w:pPr>
+      <w:r>
+        <w:rPr>
+          <w:rFonts w:ascii="Consolas" w:hAnsi="Consolas"/>
+          <w:sz w:val="16"/>
+        </w:rPr>
+      </w:r>
+    </w:p>
+    <w:p>
+      <w:pPr>
+        <w:spacing w:before="0" w:after="0" w:line="240" w:lineRule="auto"/>
+      </w:pPr>
+      <w:r>
+        <w:rPr>
+          <w:rFonts w:ascii="Consolas" w:hAnsi="Consolas"/>
+          <w:sz w:val="16"/>
+        </w:rPr>
+        <w:t>def _result(trajectory, converged):</w:t>
+      </w:r>
+    </w:p>
+    <w:p>
+      <w:pPr>
+        <w:spacing w:before="0" w:after="0" w:line="240" w:lineRule="auto"/>
+      </w:pPr>
+      <w:r>
+        <w:rPr>
+          <w:rFonts w:ascii="Consolas" w:hAnsi="Consolas"/>
+          <w:sz w:val="16"/>
+        </w:rPr>
+        <w:t xml:space="preserve">    trajectory = np.array(trajectory)</w:t>
+      </w:r>
+    </w:p>
+    <w:p>
+      <w:pPr>
+        <w:spacing w:before="0" w:after="0" w:line="240" w:lineRule="auto"/>
+      </w:pPr>
+      <w:r>
+        <w:rPr>
+          <w:rFonts w:ascii="Consolas" w:hAnsi="Consolas"/>
+          <w:sz w:val="16"/>
+        </w:rPr>
+        <w:t xml:space="preserve">    return {</w:t>
+      </w:r>
+    </w:p>
+    <w:p>
+      <w:pPr>
+        <w:spacing w:before="0" w:after="0" w:line="240" w:lineRule="auto"/>
+      </w:pPr>
+      <w:r>
+        <w:rPr>
+          <w:rFonts w:ascii="Consolas" w:hAnsi="Consolas"/>
+          <w:sz w:val="16"/>
+        </w:rPr>
+        <w:t xml:space="preserve">        'trajectory': trajectory,</w:t>
+      </w:r>
+    </w:p>
+    <w:p>
+      <w:pPr>
+        <w:spacing w:before="0" w:after="0" w:line="240" w:lineRule="auto"/>
+      </w:pPr>
+      <w:r>
+        <w:rPr>
+          <w:rFonts w:ascii="Consolas" w:hAnsi="Consolas"/>
+          <w:sz w:val="16"/>
+        </w:rPr>
+        <w:t xml:space="preserve">        'converged': converged,</w:t>
+      </w:r>
+    </w:p>
+    <w:p>
+      <w:pPr>
+        <w:spacing w:before="0" w:after="0" w:line="240" w:lineRule="auto"/>
+      </w:pPr>
+      <w:r>
+        <w:rPr>
+          <w:rFonts w:ascii="Consolas" w:hAnsi="Consolas"/>
+          <w:sz w:val="16"/>
+        </w:rPr>
+        <w:t xml:space="preserve">        'iterations': len(trajectory) - 1,</w:t>
+      </w:r>
+    </w:p>
+    <w:p>
+      <w:pPr>
+        <w:spacing w:before="0" w:after="0" w:line="240" w:lineRule="auto"/>
+      </w:pPr>
+      <w:r>
+        <w:rPr>
+          <w:rFonts w:ascii="Consolas" w:hAnsi="Consolas"/>
+          <w:sz w:val="16"/>
+        </w:rPr>
+        <w:t xml:space="preserve">        'final_efforts': trajectory[-1].copy(),</w:t>
+      </w:r>
+    </w:p>
+    <w:p>
+      <w:pPr>
+        <w:spacing w:before="0" w:after="0" w:line="240" w:lineRule="auto"/>
+      </w:pPr>
+      <w:r>
+        <w:rPr>
+          <w:rFonts w:ascii="Consolas" w:hAnsi="Consolas"/>
+          <w:sz w:val="16"/>
+        </w:rPr>
+        <w:t xml:space="preserve">    }</w:t>
+      </w:r>
+    </w:p>
+    <w:p>
+      <w:pPr>
+        <w:spacing w:before="0" w:after="0" w:line="240" w:lineRule="auto"/>
+      </w:pPr>
+      <w:r>
+        <w:rPr>
+          <w:rFonts w:ascii="Consolas" w:hAnsi="Consolas"/>
+          <w:sz w:val="16"/>
+        </w:rPr>
+      </w:r>
+    </w:p>
+    <w:p>
+      <w:pPr>
+        <w:spacing w:before="0" w:after="0" w:line="240" w:lineRule="auto"/>
+      </w:pPr>
+      <w:r>
+        <w:rPr>
+          <w:rFonts w:ascii="Consolas" w:hAnsi="Consolas"/>
+          <w:sz w:val="16"/>
+        </w:rPr>
+      </w:r>
+    </w:p>
+    <w:p>
+      <w:pPr>
+        <w:spacing w:before="0" w:after="0" w:line="240" w:lineRule="auto"/>
+      </w:pPr>
+      <w:r>
+        <w:rPr>
+          <w:rFonts w:ascii="Consolas" w:hAnsi="Consolas"/>
+          <w:sz w:val="16"/>
+        </w:rPr>
+        <w:t>def run_synchronous(contest, initial_efforts, max_iterations=1000,</w:t>
+      </w:r>
+    </w:p>
+    <w:p>
+      <w:pPr>
+        <w:spacing w:before="0" w:after="0" w:line="240" w:lineRule="auto"/>
+      </w:pPr>
+      <w:r>
+        <w:rPr>
+          <w:rFonts w:ascii="Consolas" w:hAnsi="Consolas"/>
+          <w:sz w:val="16"/>
+        </w:rPr>
+        <w:t xml:space="preserve">                    tolerance=1e-6):</w:t>
+      </w:r>
+    </w:p>
+    <w:p>
+      <w:pPr>
+        <w:spacing w:before="0" w:after="0" w:line="240" w:lineRule="auto"/>
+      </w:pPr>
+      <w:r>
+        <w:rPr>
+          <w:rFonts w:ascii="Consolas" w:hAnsi="Consolas"/>
+          <w:sz w:val="16"/>
+        </w:rPr>
+        <w:t xml:space="preserve">    """All players adopt their best response simultaneously each round."""</w:t>
+      </w:r>
+    </w:p>
+    <w:p>
+      <w:pPr>
+        <w:spacing w:before="0" w:after="0" w:line="240" w:lineRule="auto"/>
+      </w:pPr>
+      <w:r>
+        <w:rPr>
+          <w:rFonts w:ascii="Consolas" w:hAnsi="Consolas"/>
+          <w:sz w:val="16"/>
+        </w:rPr>
+        <w:t xml:space="preserve">    efforts = np.array(initial_efforts, dtype=float)</w:t>
+      </w:r>
+    </w:p>
+    <w:p>
+      <w:pPr>
+        <w:spacing w:before="0" w:after="0" w:line="240" w:lineRule="auto"/>
+      </w:pPr>
+      <w:r>
+        <w:rPr>
+          <w:rFonts w:ascii="Consolas" w:hAnsi="Consolas"/>
+          <w:sz w:val="16"/>
+        </w:rPr>
+        <w:t xml:space="preserve">    trajectory = [efforts.copy()]</w:t>
+      </w:r>
+    </w:p>
+    <w:p>
+      <w:pPr>
+        <w:spacing w:before="0" w:after="0" w:line="240" w:lineRule="auto"/>
+      </w:pPr>
+      <w:r>
+        <w:rPr>
+          <w:rFonts w:ascii="Consolas" w:hAnsi="Consolas"/>
+          <w:sz w:val="16"/>
+        </w:rPr>
+      </w:r>
+    </w:p>
+    <w:p>
+      <w:pPr>
+        <w:spacing w:before="0" w:after="0" w:line="240" w:lineRule="auto"/>
+      </w:pPr>
+      <w:r>
+        <w:rPr>
+          <w:rFonts w:ascii="Consolas" w:hAnsi="Consolas"/>
+          <w:sz w:val="16"/>
+        </w:rPr>
+        <w:t xml:space="preserve">    for _ in range(max_iterations):</w:t>
+      </w:r>
+    </w:p>
+    <w:p>
+      <w:pPr>
+        <w:spacing w:before="0" w:after="0" w:line="240" w:lineRule="auto"/>
+      </w:pPr>
+      <w:r>
+        <w:rPr>
+          <w:rFonts w:ascii="Consolas" w:hAnsi="Consolas"/>
+          <w:sz w:val="16"/>
+        </w:rPr>
+        <w:t xml:space="preserve">        new_efforts = compute_all_best_responses(contest, efforts)</w:t>
+      </w:r>
+    </w:p>
+    <w:p>
+      <w:pPr>
+        <w:spacing w:before="0" w:after="0" w:line="240" w:lineRule="auto"/>
+      </w:pPr>
+      <w:r>
+        <w:rPr>
+          <w:rFonts w:ascii="Consolas" w:hAnsi="Consolas"/>
+          <w:sz w:val="16"/>
+        </w:rPr>
+        <w:t xml:space="preserve">        max_change = np.max(np.abs(new_efforts - efforts))</w:t>
+      </w:r>
+    </w:p>
+    <w:p>
+      <w:pPr>
+        <w:spacing w:before="0" w:after="0" w:line="240" w:lineRule="auto"/>
+      </w:pPr>
+      <w:r>
+        <w:rPr>
+          <w:rFonts w:ascii="Consolas" w:hAnsi="Consolas"/>
+          <w:sz w:val="16"/>
+        </w:rPr>
+        <w:t xml:space="preserve">        trajectory.append(new_efforts.copy())</w:t>
+      </w:r>
+    </w:p>
+    <w:p>
+      <w:pPr>
+        <w:spacing w:before="0" w:after="0" w:line="240" w:lineRule="auto"/>
+      </w:pPr>
+      <w:r>
+        <w:rPr>
+          <w:rFonts w:ascii="Consolas" w:hAnsi="Consolas"/>
+          <w:sz w:val="16"/>
+        </w:rPr>
+        <w:t xml:space="preserve">        efforts = new_efforts</w:t>
+      </w:r>
+    </w:p>
+    <w:p>
+      <w:pPr>
+        <w:spacing w:before="0" w:after="0" w:line="240" w:lineRule="auto"/>
+      </w:pPr>
+      <w:r>
+        <w:rPr>
+          <w:rFonts w:ascii="Consolas" w:hAnsi="Consolas"/>
+          <w:sz w:val="16"/>
+        </w:rPr>
+      </w:r>
+    </w:p>
+    <w:p>
+      <w:pPr>
+        <w:spacing w:before="0" w:after="0" w:line="240" w:lineRule="auto"/>
+      </w:pPr>
+      <w:r>
+        <w:rPr>
+          <w:rFonts w:ascii="Consolas" w:hAnsi="Consolas"/>
+          <w:sz w:val="16"/>
+        </w:rPr>
+        <w:t xml:space="preserve">        if max_change &lt; tolerance and _at_fixed_point(contest, efforts, tolerance):</w:t>
+      </w:r>
+    </w:p>
+    <w:p>
+      <w:pPr>
+        <w:spacing w:before="0" w:after="0" w:line="240" w:lineRule="auto"/>
+      </w:pPr>
+      <w:r>
+        <w:rPr>
+          <w:rFonts w:ascii="Consolas" w:hAnsi="Consolas"/>
+          <w:sz w:val="16"/>
+        </w:rPr>
+        <w:t xml:space="preserve">            return _result(trajectory, True)</w:t>
+      </w:r>
+    </w:p>
+    <w:p>
+      <w:pPr>
+        <w:spacing w:before="0" w:after="0" w:line="240" w:lineRule="auto"/>
+      </w:pPr>
+      <w:r>
+        <w:rPr>
+          <w:rFonts w:ascii="Consolas" w:hAnsi="Consolas"/>
+          <w:sz w:val="16"/>
+        </w:rPr>
+      </w:r>
+    </w:p>
+    <w:p>
+      <w:pPr>
+        <w:spacing w:before="0" w:after="0" w:line="240" w:lineRule="auto"/>
+      </w:pPr>
+      <w:r>
+        <w:rPr>
+          <w:rFonts w:ascii="Consolas" w:hAnsi="Consolas"/>
+          <w:sz w:val="16"/>
+        </w:rPr>
+        <w:t xml:space="preserve">    return _result(trajectory, False)</w:t>
+      </w:r>
+    </w:p>
+    <w:p>
+      <w:pPr>
+        <w:spacing w:before="0" w:after="0" w:line="240" w:lineRule="auto"/>
+      </w:pPr>
+      <w:r>
+        <w:rPr>
+          <w:rFonts w:ascii="Consolas" w:hAnsi="Consolas"/>
+          <w:sz w:val="16"/>
+        </w:rPr>
+      </w:r>
+    </w:p>
+    <w:p>
+      <w:pPr>
+        <w:spacing w:before="0" w:after="0" w:line="240" w:lineRule="auto"/>
+      </w:pPr>
+      <w:r>
+        <w:rPr>
+          <w:rFonts w:ascii="Consolas" w:hAnsi="Consolas"/>
+          <w:sz w:val="16"/>
+        </w:rPr>
+      </w:r>
+    </w:p>
+    <w:p>
+      <w:pPr>
+        <w:spacing w:before="0" w:after="0" w:line="240" w:lineRule="auto"/>
+      </w:pPr>
+      <w:r>
+        <w:rPr>
+          <w:rFonts w:ascii="Consolas" w:hAnsi="Consolas"/>
+          <w:sz w:val="16"/>
+        </w:rPr>
+        <w:t>def run_asynchronous(contest, initial_efforts, max_iterations=1000,</w:t>
+      </w:r>
+    </w:p>
+    <w:p>
+      <w:pPr>
+        <w:spacing w:before="0" w:after="0" w:line="240" w:lineRule="auto"/>
+      </w:pPr>
+      <w:r>
+        <w:rPr>
+          <w:rFonts w:ascii="Consolas" w:hAnsi="Consolas"/>
+          <w:sz w:val="16"/>
+        </w:rPr>
+        <w:t xml:space="preserve">                     tolerance=1e-6, random_order=True, seed=None):</w:t>
+      </w:r>
+    </w:p>
+    <w:p>
+      <w:pPr>
+        <w:spacing w:before="0" w:after="0" w:line="240" w:lineRule="auto"/>
+      </w:pPr>
+      <w:r>
+        <w:rPr>
+          <w:rFonts w:ascii="Consolas" w:hAnsi="Consolas"/>
+          <w:sz w:val="16"/>
+        </w:rPr>
+        <w:t xml:space="preserve">    """Players update one at a time. One iteration is a full sweep of all n."""</w:t>
+      </w:r>
+    </w:p>
+    <w:p>
+      <w:pPr>
+        <w:spacing w:before="0" w:after="0" w:line="240" w:lineRule="auto"/>
+      </w:pPr>
+      <w:r>
+        <w:rPr>
+          <w:rFonts w:ascii="Consolas" w:hAnsi="Consolas"/>
+          <w:sz w:val="16"/>
+        </w:rPr>
+        <w:t xml:space="preserve">    rng = np.random.default_rng(seed)</w:t>
+      </w:r>
+    </w:p>
+    <w:p>
+      <w:pPr>
+        <w:spacing w:before="0" w:after="0" w:line="240" w:lineRule="auto"/>
+      </w:pPr>
+      <w:r>
+        <w:rPr>
+          <w:rFonts w:ascii="Consolas" w:hAnsi="Consolas"/>
+          <w:sz w:val="16"/>
+        </w:rPr>
+        <w:t xml:space="preserve">    efforts = np.array(initial_efforts, dtype=float)</w:t>
+      </w:r>
+    </w:p>
+    <w:p>
+      <w:pPr>
+        <w:spacing w:before="0" w:after="0" w:line="240" w:lineRule="auto"/>
+      </w:pPr>
+      <w:r>
+        <w:rPr>
+          <w:rFonts w:ascii="Consolas" w:hAnsi="Consolas"/>
+          <w:sz w:val="16"/>
+        </w:rPr>
+        <w:t xml:space="preserve">    trajectory = [efforts.copy()]</w:t>
+      </w:r>
+    </w:p>
+    <w:p>
+      <w:pPr>
+        <w:spacing w:before="0" w:after="0" w:line="240" w:lineRule="auto"/>
+      </w:pPr>
+      <w:r>
+        <w:rPr>
+          <w:rFonts w:ascii="Consolas" w:hAnsi="Consolas"/>
+          <w:sz w:val="16"/>
+        </w:rPr>
+      </w:r>
+    </w:p>
+    <w:p>
+      <w:pPr>
+        <w:spacing w:before="0" w:after="0" w:line="240" w:lineRule="auto"/>
+      </w:pPr>
+      <w:r>
+        <w:rPr>
+          <w:rFonts w:ascii="Consolas" w:hAnsi="Consolas"/>
+          <w:sz w:val="16"/>
+        </w:rPr>
+        <w:t xml:space="preserve">    for _ in range(max_iterations):</w:t>
+      </w:r>
+    </w:p>
+    <w:p>
+      <w:pPr>
+        <w:spacing w:before="0" w:after="0" w:line="240" w:lineRule="auto"/>
+      </w:pPr>
+      <w:r>
+        <w:rPr>
+          <w:rFonts w:ascii="Consolas" w:hAnsi="Consolas"/>
+          <w:sz w:val="16"/>
+        </w:rPr>
+        <w:t xml:space="preserve">        previous = efforts.copy()</w:t>
+      </w:r>
+    </w:p>
+    <w:p>
+      <w:pPr>
+        <w:spacing w:before="0" w:after="0" w:line="240" w:lineRule="auto"/>
+      </w:pPr>
+      <w:r>
+        <w:rPr>
+          <w:rFonts w:ascii="Consolas" w:hAnsi="Consolas"/>
+          <w:sz w:val="16"/>
+        </w:rPr>
+        <w:t xml:space="preserve">        order = rng.permutation(contest.n) if random_order else range(contest.n)</w:t>
+      </w:r>
+    </w:p>
+    <w:p>
+      <w:pPr>
+        <w:spacing w:before="0" w:after="0" w:line="240" w:lineRule="auto"/>
+      </w:pPr>
+      <w:r>
+        <w:rPr>
+          <w:rFonts w:ascii="Consolas" w:hAnsi="Consolas"/>
+          <w:sz w:val="16"/>
+        </w:rPr>
+      </w:r>
+    </w:p>
+    <w:p>
+      <w:pPr>
+        <w:spacing w:before="0" w:after="0" w:line="240" w:lineRule="auto"/>
+      </w:pPr>
+      <w:r>
+        <w:rPr>
+          <w:rFonts w:ascii="Consolas" w:hAnsi="Consolas"/>
+          <w:sz w:val="16"/>
+        </w:rPr>
+        <w:t xml:space="preserve">        for i in order:</w:t>
+      </w:r>
+    </w:p>
+    <w:p>
+      <w:pPr>
+        <w:spacing w:before="0" w:after="0" w:line="240" w:lineRule="auto"/>
+      </w:pPr>
+      <w:r>
+        <w:rPr>
+          <w:rFonts w:ascii="Consolas" w:hAnsi="Consolas"/>
+          <w:sz w:val="16"/>
+        </w:rPr>
+        <w:t xml:space="preserve">            efforts[i] = compute_best_response(contest, i, np.delete(efforts, i))</w:t>
+      </w:r>
+    </w:p>
+    <w:p>
+      <w:pPr>
+        <w:spacing w:before="0" w:after="0" w:line="240" w:lineRule="auto"/>
+      </w:pPr>
+      <w:r>
+        <w:rPr>
+          <w:rFonts w:ascii="Consolas" w:hAnsi="Consolas"/>
+          <w:sz w:val="16"/>
+        </w:rPr>
+      </w:r>
+    </w:p>
+    <w:p>
+      <w:pPr>
+        <w:spacing w:before="0" w:after="0" w:line="240" w:lineRule="auto"/>
+      </w:pPr>
+      <w:r>
+        <w:rPr>
+          <w:rFonts w:ascii="Consolas" w:hAnsi="Consolas"/>
+          <w:sz w:val="16"/>
+        </w:rPr>
+        <w:t xml:space="preserve">        trajectory.append(efforts.copy())</w:t>
+      </w:r>
+    </w:p>
+    <w:p>
+      <w:pPr>
+        <w:spacing w:before="0" w:after="0" w:line="240" w:lineRule="auto"/>
+      </w:pPr>
+      <w:r>
+        <w:rPr>
+          <w:rFonts w:ascii="Consolas" w:hAnsi="Consolas"/>
+          <w:sz w:val="16"/>
+        </w:rPr>
+      </w:r>
+    </w:p>
+    <w:p>
+      <w:pPr>
+        <w:spacing w:before="0" w:after="0" w:line="240" w:lineRule="auto"/>
+      </w:pPr>
+      <w:r>
+        <w:rPr>
+          <w:rFonts w:ascii="Consolas" w:hAnsi="Consolas"/>
+          <w:sz w:val="16"/>
+        </w:rPr>
+        <w:t xml:space="preserve">        if (np.max(np.abs(efforts - previous)) &lt; tolerance</w:t>
+      </w:r>
+    </w:p>
+    <w:p>
+      <w:pPr>
+        <w:spacing w:before="0" w:after="0" w:line="240" w:lineRule="auto"/>
+      </w:pPr>
+      <w:r>
+        <w:rPr>
+          <w:rFonts w:ascii="Consolas" w:hAnsi="Consolas"/>
+          <w:sz w:val="16"/>
+        </w:rPr>
+        <w:t xml:space="preserve">                and _at_fixed_point(contest, efforts, tolerance)):</w:t>
+      </w:r>
+    </w:p>
+    <w:p>
+      <w:pPr>
+        <w:spacing w:before="0" w:after="0" w:line="240" w:lineRule="auto"/>
+      </w:pPr>
+      <w:r>
+        <w:rPr>
+          <w:rFonts w:ascii="Consolas" w:hAnsi="Consolas"/>
+          <w:sz w:val="16"/>
+        </w:rPr>
+        <w:t xml:space="preserve">            return _result(trajectory, True)</w:t>
+      </w:r>
+    </w:p>
+    <w:p>
+      <w:pPr>
+        <w:spacing w:before="0" w:after="0" w:line="240" w:lineRule="auto"/>
+      </w:pPr>
+      <w:r>
+        <w:rPr>
+          <w:rFonts w:ascii="Consolas" w:hAnsi="Consolas"/>
+          <w:sz w:val="16"/>
+        </w:rPr>
+      </w:r>
+    </w:p>
+    <w:p>
+      <w:pPr>
+        <w:spacing w:before="0" w:after="0" w:line="240" w:lineRule="auto"/>
+      </w:pPr>
+      <w:r>
+        <w:rPr>
+          <w:rFonts w:ascii="Consolas" w:hAnsi="Consolas"/>
+          <w:sz w:val="16"/>
+        </w:rPr>
+        <w:t xml:space="preserve">    return _result(trajectory, False)</w:t>
+      </w:r>
+    </w:p>
+    <w:p>
+      <w:pPr>
+        <w:spacing w:before="0" w:after="0" w:line="240" w:lineRule="auto"/>
+      </w:pPr>
+      <w:r>
+        <w:rPr>
+          <w:rFonts w:ascii="Consolas" w:hAnsi="Consolas"/>
+          <w:sz w:val="16"/>
+        </w:rPr>
+      </w:r>
+    </w:p>
+    <w:p>
+      <w:pPr>
+        <w:spacing w:before="0" w:after="0" w:line="240" w:lineRule="auto"/>
+      </w:pPr>
+      <w:r>
+        <w:rPr>
+          <w:rFonts w:ascii="Consolas" w:hAnsi="Consolas"/>
+          <w:sz w:val="16"/>
+        </w:rPr>
+      </w:r>
+    </w:p>
+    <w:p>
+      <w:pPr>
+        <w:spacing w:before="0" w:after="0" w:line="240" w:lineRule="auto"/>
+      </w:pPr>
+      <w:r>
+        <w:rPr>
+          <w:rFonts w:ascii="Consolas" w:hAnsi="Consolas"/>
+          <w:sz w:val="16"/>
+        </w:rPr>
+        <w:t>def run_inertial(contest, initial_efforts, lam=0.5, max_iterations=1000,</w:t>
+      </w:r>
+    </w:p>
+    <w:p>
+      <w:pPr>
+        <w:spacing w:before="0" w:after="0" w:line="240" w:lineRule="auto"/>
+      </w:pPr>
+      <w:r>
+        <w:rPr>
+          <w:rFonts w:ascii="Consolas" w:hAnsi="Consolas"/>
+          <w:sz w:val="16"/>
+        </w:rPr>
+        <w:t xml:space="preserve">                 tolerance=1e-6):</w:t>
+      </w:r>
+    </w:p>
+    <w:p>
+      <w:pPr>
+        <w:spacing w:before="0" w:after="0" w:line="240" w:lineRule="auto"/>
+      </w:pPr>
+      <w:r>
+        <w:rPr>
+          <w:rFonts w:ascii="Consolas" w:hAnsi="Consolas"/>
+          <w:sz w:val="16"/>
+        </w:rPr>
+        <w:t xml:space="preserve">    """x(t+1) = (1 - lam) * x(t) + lam * BR(x(t)).</w:t>
+      </w:r>
+    </w:p>
+    <w:p>
+      <w:pPr>
+        <w:spacing w:before="0" w:after="0" w:line="240" w:lineRule="auto"/>
+      </w:pPr>
+      <w:r>
+        <w:rPr>
+          <w:rFonts w:ascii="Consolas" w:hAnsi="Consolas"/>
+          <w:sz w:val="16"/>
+        </w:rPr>
+      </w:r>
+    </w:p>
+    <w:p>
+      <w:pPr>
+        <w:spacing w:before="0" w:after="0" w:line="240" w:lineRule="auto"/>
+      </w:pPr>
+      <w:r>
+        <w:rPr>
+          <w:rFonts w:ascii="Consolas" w:hAnsi="Consolas"/>
+          <w:sz w:val="16"/>
+        </w:rPr>
+        <w:t xml:space="preserve">    lam = 1 is the synchronous rule; smaller values damp the adjustment.</w:t>
+      </w:r>
+    </w:p>
+    <w:p>
+      <w:pPr>
+        <w:spacing w:before="0" w:after="0" w:line="240" w:lineRule="auto"/>
+      </w:pPr>
+      <w:r>
+        <w:rPr>
+          <w:rFonts w:ascii="Consolas" w:hAnsi="Consolas"/>
+          <w:sz w:val="16"/>
+        </w:rPr>
+        <w:t xml:space="preserve">    """</w:t>
+      </w:r>
+    </w:p>
+    <w:p>
+      <w:pPr>
+        <w:spacing w:before="0" w:after="0" w:line="240" w:lineRule="auto"/>
+      </w:pPr>
+      <w:r>
+        <w:rPr>
+          <w:rFonts w:ascii="Consolas" w:hAnsi="Consolas"/>
+          <w:sz w:val="16"/>
+        </w:rPr>
+        <w:t xml:space="preserve">    if not 0 &lt; lam &lt;= 1:</w:t>
+      </w:r>
+    </w:p>
+    <w:p>
+      <w:pPr>
+        <w:spacing w:before="0" w:after="0" w:line="240" w:lineRule="auto"/>
+      </w:pPr>
+      <w:r>
+        <w:rPr>
+          <w:rFonts w:ascii="Consolas" w:hAnsi="Consolas"/>
+          <w:sz w:val="16"/>
+        </w:rPr>
+        <w:t xml:space="preserve">        raise ValueError(f"lam must be in (0, 1], got {lam}")</w:t>
+      </w:r>
+    </w:p>
+    <w:p>
+      <w:pPr>
+        <w:spacing w:before="0" w:after="0" w:line="240" w:lineRule="auto"/>
+      </w:pPr>
+      <w:r>
+        <w:rPr>
+          <w:rFonts w:ascii="Consolas" w:hAnsi="Consolas"/>
+          <w:sz w:val="16"/>
+        </w:rPr>
+      </w:r>
+    </w:p>
+    <w:p>
+      <w:pPr>
+        <w:spacing w:before="0" w:after="0" w:line="240" w:lineRule="auto"/>
+      </w:pPr>
+      <w:r>
+        <w:rPr>
+          <w:rFonts w:ascii="Consolas" w:hAnsi="Consolas"/>
+          <w:sz w:val="16"/>
+        </w:rPr>
+        <w:t xml:space="preserve">    efforts = np.array(initial_efforts, dtype=float)</w:t>
+      </w:r>
+    </w:p>
+    <w:p>
+      <w:pPr>
+        <w:spacing w:before="0" w:after="0" w:line="240" w:lineRule="auto"/>
+      </w:pPr>
+      <w:r>
+        <w:rPr>
+          <w:rFonts w:ascii="Consolas" w:hAnsi="Consolas"/>
+          <w:sz w:val="16"/>
+        </w:rPr>
+        <w:t xml:space="preserve">    trajectory = [efforts.copy()]</w:t>
+      </w:r>
+    </w:p>
+    <w:p>
+      <w:pPr>
+        <w:spacing w:before="0" w:after="0" w:line="240" w:lineRule="auto"/>
+      </w:pPr>
+      <w:r>
+        <w:rPr>
+          <w:rFonts w:ascii="Consolas" w:hAnsi="Consolas"/>
+          <w:sz w:val="16"/>
+        </w:rPr>
+      </w:r>
+    </w:p>
+    <w:p>
+      <w:pPr>
+        <w:spacing w:before="0" w:after="0" w:line="240" w:lineRule="auto"/>
+      </w:pPr>
+      <w:r>
+        <w:rPr>
+          <w:rFonts w:ascii="Consolas" w:hAnsi="Consolas"/>
+          <w:sz w:val="16"/>
+        </w:rPr>
+        <w:t xml:space="preserve">    for _ in range(max_iterations):</w:t>
+      </w:r>
+    </w:p>
+    <w:p>
+      <w:pPr>
+        <w:spacing w:before="0" w:after="0" w:line="240" w:lineRule="auto"/>
+      </w:pPr>
+      <w:r>
+        <w:rPr>
+          <w:rFonts w:ascii="Consolas" w:hAnsi="Consolas"/>
+          <w:sz w:val="16"/>
+        </w:rPr>
+        <w:t xml:space="preserve">        target = compute_all_best_responses(contest, efforts)</w:t>
+      </w:r>
+    </w:p>
+    <w:p>
+      <w:pPr>
+        <w:spacing w:before="0" w:after="0" w:line="240" w:lineRule="auto"/>
+      </w:pPr>
+      <w:r>
+        <w:rPr>
+          <w:rFonts w:ascii="Consolas" w:hAnsi="Consolas"/>
+          <w:sz w:val="16"/>
+        </w:rPr>
+        <w:t xml:space="preserve">        new_efforts = (1 - lam) * efforts + lam * target</w:t>
+      </w:r>
+    </w:p>
+    <w:p>
+      <w:pPr>
+        <w:spacing w:before="0" w:after="0" w:line="240" w:lineRule="auto"/>
+      </w:pPr>
+      <w:r>
+        <w:rPr>
+          <w:rFonts w:ascii="Consolas" w:hAnsi="Consolas"/>
+          <w:sz w:val="16"/>
+        </w:rPr>
+        <w:t xml:space="preserve">        max_change = np.max(np.abs(new_efforts - efforts))</w:t>
+      </w:r>
+    </w:p>
+    <w:p>
+      <w:pPr>
+        <w:spacing w:before="0" w:after="0" w:line="240" w:lineRule="auto"/>
+      </w:pPr>
+      <w:r>
+        <w:rPr>
+          <w:rFonts w:ascii="Consolas" w:hAnsi="Consolas"/>
+          <w:sz w:val="16"/>
+        </w:rPr>
+        <w:t xml:space="preserve">        trajectory.append(new_efforts.copy())</w:t>
+      </w:r>
+    </w:p>
+    <w:p>
+      <w:pPr>
+        <w:spacing w:before="0" w:after="0" w:line="240" w:lineRule="auto"/>
+      </w:pPr>
+      <w:r>
+        <w:rPr>
+          <w:rFonts w:ascii="Consolas" w:hAnsi="Consolas"/>
+          <w:sz w:val="16"/>
+        </w:rPr>
+        <w:t xml:space="preserve">        efforts = new_efforts</w:t>
+      </w:r>
+    </w:p>
+    <w:p>
+      <w:pPr>
+        <w:spacing w:before="0" w:after="0" w:line="240" w:lineRule="auto"/>
+      </w:pPr>
+      <w:r>
+        <w:rPr>
+          <w:rFonts w:ascii="Consolas" w:hAnsi="Consolas"/>
+          <w:sz w:val="16"/>
+        </w:rPr>
+      </w:r>
+    </w:p>
+    <w:p>
+      <w:pPr>
+        <w:spacing w:before="0" w:after="0" w:line="240" w:lineRule="auto"/>
+      </w:pPr>
+      <w:r>
+        <w:rPr>
+          <w:rFonts w:ascii="Consolas" w:hAnsi="Consolas"/>
+          <w:sz w:val="16"/>
+        </w:rPr>
+        <w:t xml:space="preserve">        if max_change &lt; tolerance and _at_fixed_point(contest, efforts, tolerance):</w:t>
+      </w:r>
+    </w:p>
+    <w:p>
+      <w:pPr>
+        <w:spacing w:before="0" w:after="0" w:line="240" w:lineRule="auto"/>
+      </w:pPr>
+      <w:r>
+        <w:rPr>
+          <w:rFonts w:ascii="Consolas" w:hAnsi="Consolas"/>
+          <w:sz w:val="16"/>
+        </w:rPr>
+        <w:t xml:space="preserve">            return _result(trajectory, True)</w:t>
+      </w:r>
+    </w:p>
+    <w:p>
+      <w:pPr>
+        <w:spacing w:before="0" w:after="0" w:line="240" w:lineRule="auto"/>
+      </w:pPr>
+      <w:r>
+        <w:rPr>
+          <w:rFonts w:ascii="Consolas" w:hAnsi="Consolas"/>
+          <w:sz w:val="16"/>
+        </w:rPr>
+      </w:r>
+    </w:p>
+    <w:p>
+      <w:pPr>
+        <w:spacing w:before="0" w:after="0" w:line="240" w:lineRule="auto"/>
+      </w:pPr>
+      <w:r>
+        <w:rPr>
+          <w:rFonts w:ascii="Consolas" w:hAnsi="Consolas"/>
+          <w:sz w:val="16"/>
+        </w:rPr>
+        <w:t xml:space="preserve">    return _result(trajectory, False)</w:t>
+      </w:r>
+    </w:p>
+    <w:p/>
     <w:sectPr>
       <w:footerReference w:type="default" r:id="rId9"/>
       <w:pgSz w:w="12240" w:h="15840"/>

</xml_diff>

<commit_message>
cite Judd and Miranda & Fackler in 2.6, they were in the refs but not the text
</commit_message>
<xml_diff>
--- a/results/dissertation.docx
+++ b/results/dissertation.docx
@@ -835,6 +835,18 @@
       </w:pPr>
       <w:r>
         <w:t>2.6 Technology Survey</w:t>
+      </w:r>
+    </w:p>
+    <w:p>
+      <w:pPr>
+        <w:jc w:val="both"/>
+      </w:pPr>
+      <w:r>
+        <w:rPr>
+          <w:b w:val="0"/>
+          <w:sz w:val="24"/>
+        </w:rPr>
+        <w:t>Two general references informed the computational approach. Judd (1998) sets out the numerical methods used in economics and stresses exploiting the structure of the problem rather than treating it as a black box, which is what makes the vectorised payoff evaluation and the derived search ceiling of Section 3.2 possible. Miranda and Fackler (2002) cover computational methods for dynamic games, including the basin of attraction analysis that motivated running every configuration from multiple random starting points rather than from a single one.</w:t>
       </w:r>
     </w:p>
     <w:p>

</xml_diff>